<commit_message>
Add bullet/bold auto-formatting to all content cells
Enhanced _text_to_rich() to detect and split concatenated dash-separated
lists (e.g. "- item1 - item2 - item3" on one line) into individual bullet
paragraphs. Also handles "Label: - item1 - item2" patterns as bold label
followed by bullets. Changed all content cell writes to use _cell_para_auto()
so lists of SLOs, materials, and other items render as formatted bullets
throughout all 9 output documents.

https://claude.ai/code/session_01J9jEA4DnFx8YWZJcajHJKQ
</commit_message>
<xml_diff>
--- a/data/outputs/Seavuria_Reformatted/Chemistry_10_SubStrand1.4_ChemicalBonding_FinalExplanation.docx
+++ b/data/outputs/Seavuria_Reformatted/Chemistry_10_SubStrand1.4_ChemicalBonding_FinalExplanation.docx
@@ -296,7 +296,7 @@
           </w:tcPr>
           <w:p>
             <w:pPr>
-              <w:spacing w:before="40" w:after="40"/>
+              <w:spacing w:before="20" w:after="20"/>
               <w:jc w:val="left"/>
             </w:pPr>
             <w:r>
@@ -308,8 +308,21 @@
                 <w:sz w:val="18"/>
               </w:rPr>
               <w:t>You have completed all 13 lessons of Sub-Strand 1.4: Chemical Bonding. Write your COMPLETE EXPLANATION by answering all sections below. Driving Question: How do the bonds between atoms determine the properties and uses of substances?</w:t>
-              <w:br/>
-              <w:br/>
+            </w:r>
+          </w:p>
+          <w:p>
+            <w:pPr>
+              <w:spacing w:before="20" w:after="20"/>
+              <w:jc w:val="left"/>
+            </w:pPr>
+            <w:r>
+              <w:rPr>
+                <w:rFonts w:ascii="Arial" w:hAnsi="Arial"/>
+                <w:b w:val="0"/>
+                <w:i w:val="0"/>
+                <w:color w:val="000000"/>
+                <w:sz w:val="18"/>
+              </w:rPr>
               <w:t>Use evidence from investigations, discussions, and models from across this unit. Use scientific vocabulary accurately. Include labeled diagrams where appropriate. Show all calculations with steps. Connect your explanations back to the anchoring phenomenon throughout.</w:t>
             </w:r>
           </w:p>
@@ -779,7 +792,7 @@
           </w:tcPr>
           <w:p>
             <w:pPr>
-              <w:spacing w:before="40" w:after="40"/>
+              <w:spacing w:before="20" w:after="20"/>
               <w:jc w:val="left"/>
             </w:pPr>
             <w:r>
@@ -791,11 +804,53 @@
                 <w:sz w:val="18"/>
               </w:rPr>
               <w:t>What makes an atom stable or unstable?</w:t>
-              <w:br/>
+            </w:r>
+          </w:p>
+          <w:p>
+            <w:pPr>
+              <w:spacing w:before="20" w:after="20"/>
+              <w:jc w:val="left"/>
+            </w:pPr>
+            <w:r>
+              <w:rPr>
+                <w:rFonts w:ascii="Arial" w:hAnsi="Arial"/>
+                <w:b w:val="0"/>
+                <w:i w:val="0"/>
+                <w:color w:val="000000"/>
+                <w:sz w:val="18"/>
+              </w:rPr>
               <w:t>What are valence electrons and why are they important?</w:t>
-              <w:br/>
+            </w:r>
+          </w:p>
+          <w:p>
+            <w:pPr>
+              <w:spacing w:before="20" w:after="20"/>
+              <w:jc w:val="left"/>
+            </w:pPr>
+            <w:r>
+              <w:rPr>
+                <w:rFonts w:ascii="Arial" w:hAnsi="Arial"/>
+                <w:b w:val="0"/>
+                <w:i w:val="0"/>
+                <w:color w:val="000000"/>
+                <w:sz w:val="18"/>
+              </w:rPr>
               <w:t>What is the octet rule? When does the duplet rule apply?</w:t>
-              <w:br/>
+            </w:r>
+          </w:p>
+          <w:p>
+            <w:pPr>
+              <w:spacing w:before="20" w:after="20"/>
+              <w:jc w:val="left"/>
+            </w:pPr>
+            <w:r>
+              <w:rPr>
+                <w:rFonts w:ascii="Arial" w:hAnsi="Arial"/>
+                <w:b w:val="0"/>
+                <w:i w:val="0"/>
+                <w:color w:val="000000"/>
+                <w:sz w:val="18"/>
+              </w:rPr>
               <w:t>How does bonding help atoms achieve stability?</w:t>
             </w:r>
           </w:p>
@@ -809,7 +864,7 @@
           </w:tcPr>
           <w:p>
             <w:pPr>
-              <w:spacing w:before="40" w:after="40"/>
+              <w:spacing w:before="20" w:after="20"/>
               <w:jc w:val="left"/>
             </w:pPr>
             <w:r>
@@ -821,8 +876,21 @@
                 <w:sz w:val="18"/>
               </w:rPr>
               <w:t>Atoms are stable when their outermost shell (valence shell) is full. Valence electrons are the electrons in the outermost shell — they determine how an atom bonds. Most atoms follow the octet rule: they become stable with 8 valence electrons (like noble gases). Hydrogen and helium follow the duplet rule: stable with 2 electrons.</w:t>
-              <w:br/>
-              <w:br/>
+            </w:r>
+          </w:p>
+          <w:p>
+            <w:pPr>
+              <w:spacing w:before="20" w:after="20"/>
+              <w:jc w:val="left"/>
+            </w:pPr>
+            <w:r>
+              <w:rPr>
+                <w:rFonts w:ascii="Arial" w:hAnsi="Arial"/>
+                <w:b w:val="0"/>
+                <w:i w:val="0"/>
+                <w:color w:val="000000"/>
+                <w:sz w:val="18"/>
+              </w:rPr>
               <w:t>Carbon has 4 valence electrons (outer shell: 2,4) and needs 4 more to complete its octet. It achieves stability by forming 4 bonds with other atoms — either ionic or covalent depending on what it bonds with. Bonding allows atoms to reach the electron configuration of the nearest noble gas, which is the lowest-energy, most stable arrangement.</w:t>
             </w:r>
           </w:p>
@@ -884,7 +952,7 @@
           </w:tcPr>
           <w:p>
             <w:pPr>
-              <w:spacing w:before="40" w:after="40"/>
+              <w:spacing w:before="20" w:after="20"/>
               <w:jc w:val="left"/>
             </w:pPr>
             <w:r>
@@ -896,13 +964,69 @@
                 <w:sz w:val="18"/>
               </w:rPr>
               <w:t>How do ionic bonds form through electron transfer?</w:t>
-              <w:br/>
+            </w:r>
+          </w:p>
+          <w:p>
+            <w:pPr>
+              <w:spacing w:before="20" w:after="20"/>
+              <w:jc w:val="left"/>
+            </w:pPr>
+            <w:r>
+              <w:rPr>
+                <w:rFonts w:ascii="Arial" w:hAnsi="Arial"/>
+                <w:b w:val="0"/>
+                <w:i w:val="0"/>
+                <w:color w:val="000000"/>
+                <w:sz w:val="18"/>
+              </w:rPr>
               <w:t>What types of atoms form ionic bonds?</w:t>
-              <w:br/>
+            </w:r>
+          </w:p>
+          <w:p>
+            <w:pPr>
+              <w:spacing w:before="20" w:after="20"/>
+              <w:jc w:val="left"/>
+            </w:pPr>
+            <w:r>
+              <w:rPr>
+                <w:rFonts w:ascii="Arial" w:hAnsi="Arial"/>
+                <w:b w:val="0"/>
+                <w:i w:val="0"/>
+                <w:color w:val="000000"/>
+                <w:sz w:val="18"/>
+              </w:rPr>
               <w:t>How can we represent ionic bonding using Lewis diagrams?</w:t>
-              <w:br/>
+            </w:r>
+          </w:p>
+          <w:p>
+            <w:pPr>
+              <w:spacing w:before="20" w:after="20"/>
+              <w:jc w:val="left"/>
+            </w:pPr>
+            <w:r>
+              <w:rPr>
+                <w:rFonts w:ascii="Arial" w:hAnsi="Arial"/>
+                <w:b w:val="0"/>
+                <w:i w:val="0"/>
+                <w:color w:val="000000"/>
+                <w:sz w:val="18"/>
+              </w:rPr>
               <w:t>What properties do ionic compounds have (melting point, conductivity, solubility, brittleness)?</w:t>
-              <w:br/>
+            </w:r>
+          </w:p>
+          <w:p>
+            <w:pPr>
+              <w:spacing w:before="20" w:after="20"/>
+              <w:jc w:val="left"/>
+            </w:pPr>
+            <w:r>
+              <w:rPr>
+                <w:rFonts w:ascii="Arial" w:hAnsi="Arial"/>
+                <w:b w:val="0"/>
+                <w:i w:val="0"/>
+                <w:color w:val="000000"/>
+                <w:sz w:val="18"/>
+              </w:rPr>
               <w:t>Why do ionic compounds have these properties?</w:t>
             </w:r>
           </w:p>
@@ -916,7 +1040,7 @@
           </w:tcPr>
           <w:p>
             <w:pPr>
-              <w:spacing w:before="40" w:after="40"/>
+              <w:spacing w:before="20" w:after="20"/>
               <w:jc w:val="left"/>
             </w:pPr>
             <w:r>
@@ -928,19 +1052,105 @@
                 <w:sz w:val="18"/>
               </w:rPr>
               <w:t>Ionic bonds form when a metal atom transfers one or more electrons to a non-metal atom. The metal loses electrons to form a positive ion (cation); the non-metal gains electrons to form a negative ion (anion). The strong electrostatic attraction between oppositely charged ions is the ionic bond.</w:t>
-              <w:br/>
-              <w:br/>
+            </w:r>
+          </w:p>
+          <w:p>
+            <w:pPr>
+              <w:spacing w:before="20" w:after="20"/>
+              <w:jc w:val="left"/>
+            </w:pPr>
+            <w:r>
+              <w:rPr>
+                <w:rFonts w:ascii="Arial" w:hAnsi="Arial"/>
+                <w:b w:val="0"/>
+                <w:i w:val="0"/>
+                <w:color w:val="000000"/>
+                <w:sz w:val="18"/>
+              </w:rPr>
               <w:t>Example (Lewis diagram): Na· + ·Cl: → Na⁺ [:Cl:]⁻ — sodium transfers its 1 valence electron to chlorine, giving both the configuration of the nearest noble gas.</w:t>
-              <w:br/>
-              <w:br/>
+            </w:r>
+          </w:p>
+          <w:p>
+            <w:pPr>
+              <w:spacing w:before="20" w:after="20"/>
+              <w:jc w:val="left"/>
+            </w:pPr>
+            <w:r>
+              <w:rPr>
+                <w:rFonts w:ascii="Arial" w:hAnsi="Arial"/>
+                <w:b w:val="0"/>
+                <w:i w:val="0"/>
+                <w:color w:val="000000"/>
+                <w:sz w:val="18"/>
+              </w:rPr>
               <w:t>Ionic compounds form giant ionic lattices — a regular 3D arrangement of millions of ions. This explains their properties:</w:t>
-              <w:br/>
+            </w:r>
+          </w:p>
+          <w:p>
+            <w:pPr>
+              <w:spacing w:before="20" w:after="20"/>
+              <w:ind w:left="240"/>
+              <w:jc w:val="left"/>
+            </w:pPr>
+            <w:r>
+              <w:rPr>
+                <w:rFonts w:ascii="Arial" w:hAnsi="Arial"/>
+                <w:b w:val="0"/>
+                <w:i w:val="0"/>
+                <w:color w:val="000000"/>
+                <w:sz w:val="18"/>
+              </w:rPr>
               <w:t>• High melting/boiling points: strong electrostatic forces require a lot of energy to break.</w:t>
-              <w:br/>
+            </w:r>
+          </w:p>
+          <w:p>
+            <w:pPr>
+              <w:spacing w:before="20" w:after="20"/>
+              <w:ind w:left="240"/>
+              <w:jc w:val="left"/>
+            </w:pPr>
+            <w:r>
+              <w:rPr>
+                <w:rFonts w:ascii="Arial" w:hAnsi="Arial"/>
+                <w:b w:val="0"/>
+                <w:i w:val="0"/>
+                <w:color w:val="000000"/>
+                <w:sz w:val="18"/>
+              </w:rPr>
               <w:t>• Conduct electricity when molten or dissolved (ions are free to move), but NOT as solids (ions locked in lattice).</w:t>
-              <w:br/>
+            </w:r>
+          </w:p>
+          <w:p>
+            <w:pPr>
+              <w:spacing w:before="20" w:after="20"/>
+              <w:ind w:left="240"/>
+              <w:jc w:val="left"/>
+            </w:pPr>
+            <w:r>
+              <w:rPr>
+                <w:rFonts w:ascii="Arial" w:hAnsi="Arial"/>
+                <w:b w:val="0"/>
+                <w:i w:val="0"/>
+                <w:color w:val="000000"/>
+                <w:sz w:val="18"/>
+              </w:rPr>
               <w:t>• Soluble in water: polar water molecules surround and separate the ions.</w:t>
-              <w:br/>
+            </w:r>
+          </w:p>
+          <w:p>
+            <w:pPr>
+              <w:spacing w:before="20" w:after="20"/>
+              <w:ind w:left="240"/>
+              <w:jc w:val="left"/>
+            </w:pPr>
+            <w:r>
+              <w:rPr>
+                <w:rFonts w:ascii="Arial" w:hAnsi="Arial"/>
+                <w:b w:val="0"/>
+                <w:i w:val="0"/>
+                <w:color w:val="000000"/>
+                <w:sz w:val="18"/>
+              </w:rPr>
               <w:t>• Brittle: shifting layers brings like charges together, creating repulsion that shatters the crystal.</w:t>
             </w:r>
           </w:p>
@@ -1002,7 +1212,7 @@
           </w:tcPr>
           <w:p>
             <w:pPr>
-              <w:spacing w:before="40" w:after="40"/>
+              <w:spacing w:before="20" w:after="20"/>
               <w:jc w:val="left"/>
             </w:pPr>
             <w:r>
@@ -1014,13 +1224,69 @@
                 <w:sz w:val="18"/>
               </w:rPr>
               <w:t>How do covalent bonds form through electron sharing?</w:t>
-              <w:br/>
+            </w:r>
+          </w:p>
+          <w:p>
+            <w:pPr>
+              <w:spacing w:before="20" w:after="20"/>
+              <w:jc w:val="left"/>
+            </w:pPr>
+            <w:r>
+              <w:rPr>
+                <w:rFonts w:ascii="Arial" w:hAnsi="Arial"/>
+                <w:b w:val="0"/>
+                <w:i w:val="0"/>
+                <w:color w:val="000000"/>
+                <w:sz w:val="18"/>
+              </w:rPr>
               <w:t>What is the difference between simple molecular and giant covalent structures?</w:t>
-              <w:br/>
+            </w:r>
+          </w:p>
+          <w:p>
+            <w:pPr>
+              <w:spacing w:before="20" w:after="20"/>
+              <w:jc w:val="left"/>
+            </w:pPr>
+            <w:r>
+              <w:rPr>
+                <w:rFonts w:ascii="Arial" w:hAnsi="Arial"/>
+                <w:b w:val="0"/>
+                <w:i w:val="0"/>
+                <w:color w:val="000000"/>
+                <w:sz w:val="18"/>
+              </w:rPr>
               <w:t>How do diamond and graphite differ in structure despite both being carbon?</w:t>
-              <w:br/>
+            </w:r>
+          </w:p>
+          <w:p>
+            <w:pPr>
+              <w:spacing w:before="20" w:after="20"/>
+              <w:jc w:val="left"/>
+            </w:pPr>
+            <w:r>
+              <w:rPr>
+                <w:rFonts w:ascii="Arial" w:hAnsi="Arial"/>
+                <w:b w:val="0"/>
+                <w:i w:val="0"/>
+                <w:color w:val="000000"/>
+                <w:sz w:val="18"/>
+              </w:rPr>
               <w:t>What properties do simple molecular substances have vs. giant covalent structures?</w:t>
-              <w:br/>
+            </w:r>
+          </w:p>
+          <w:p>
+            <w:pPr>
+              <w:spacing w:before="20" w:after="20"/>
+              <w:jc w:val="left"/>
+            </w:pPr>
+            <w:r>
+              <w:rPr>
+                <w:rFonts w:ascii="Arial" w:hAnsi="Arial"/>
+                <w:b w:val="0"/>
+                <w:i w:val="0"/>
+                <w:color w:val="000000"/>
+                <w:sz w:val="18"/>
+              </w:rPr>
               <w:t>Draw Lewis diagrams for simple molecules (H₂, H₂O, CO₂, CH₄).</w:t>
             </w:r>
           </w:p>
@@ -1034,7 +1300,7 @@
           </w:tcPr>
           <w:p>
             <w:pPr>
-              <w:spacing w:before="40" w:after="40"/>
+              <w:spacing w:before="20" w:after="20"/>
               <w:jc w:val="left"/>
             </w:pPr>
             <w:r>
@@ -1046,18 +1312,87 @@
                 <w:sz w:val="18"/>
               </w:rPr>
               <w:t>Covalent bonds form when two non-metal atoms share electrons to achieve full outer shells. Each shared pair of electrons counts toward the octet of both atoms.</w:t>
-              <w:br/>
-              <w:br/>
+            </w:r>
+          </w:p>
+          <w:p>
+            <w:pPr>
+              <w:spacing w:before="20" w:after="20"/>
+              <w:jc w:val="left"/>
+            </w:pPr>
+            <w:r>
+              <w:rPr>
+                <w:rFonts w:ascii="Arial" w:hAnsi="Arial"/>
+                <w:b w:val="0"/>
+                <w:i w:val="0"/>
+                <w:color w:val="000000"/>
+                <w:sz w:val="18"/>
+              </w:rPr>
               <w:t>Lewis diagrams: H–H (H₂: 1 shared pair), H–O–H with 2 lone pairs on O (H₂O), O=C=O (CO₂: 2 double bonds), H–C–H with 4 single bonds (CH₄).</w:t>
-              <w:br/>
-              <w:br/>
+            </w:r>
+          </w:p>
+          <w:p>
+            <w:pPr>
+              <w:spacing w:before="20" w:after="20"/>
+              <w:jc w:val="left"/>
+            </w:pPr>
+            <w:r>
+              <w:rPr>
+                <w:rFonts w:ascii="Arial" w:hAnsi="Arial"/>
+                <w:b w:val="0"/>
+                <w:i w:val="0"/>
+                <w:color w:val="000000"/>
+                <w:sz w:val="18"/>
+              </w:rPr>
               <w:t>Simple molecular structures (H₂O, CO₂, CH₄): small molecules held together by strong covalent bonds, but the forces BETWEEN molecules (Van der Waals / hydrogen bonds) are weak. Result: low melting/boiling points, do not conduct electricity.</w:t>
-              <w:br/>
-              <w:br/>
+            </w:r>
+          </w:p>
+          <w:p>
+            <w:pPr>
+              <w:spacing w:before="20" w:after="20"/>
+              <w:jc w:val="left"/>
+            </w:pPr>
+            <w:r>
+              <w:rPr>
+                <w:rFonts w:ascii="Arial" w:hAnsi="Arial"/>
+                <w:b w:val="0"/>
+                <w:i w:val="0"/>
+                <w:color w:val="000000"/>
+                <w:sz w:val="18"/>
+              </w:rPr>
               <w:t>Giant covalent structures: millions of atoms bonded in a continuous 3D network.</w:t>
-              <w:br/>
+            </w:r>
+          </w:p>
+          <w:p>
+            <w:pPr>
+              <w:spacing w:before="20" w:after="20"/>
+              <w:ind w:left="240"/>
+              <w:jc w:val="left"/>
+            </w:pPr>
+            <w:r>
+              <w:rPr>
+                <w:rFonts w:ascii="Arial" w:hAnsi="Arial"/>
+                <w:b w:val="0"/>
+                <w:i w:val="0"/>
+                <w:color w:val="000000"/>
+                <w:sz w:val="18"/>
+              </w:rPr>
               <w:t>• Diamond: each carbon forms 4 strong covalent bonds to 4 other carbons in a tetrahedral structure. No free electrons → does not conduct. All bonds must break to melt → very high melting point → extremely hard.</w:t>
-              <w:br/>
+            </w:r>
+          </w:p>
+          <w:p>
+            <w:pPr>
+              <w:spacing w:before="20" w:after="20"/>
+              <w:ind w:left="240"/>
+              <w:jc w:val="left"/>
+            </w:pPr>
+            <w:r>
+              <w:rPr>
+                <w:rFonts w:ascii="Arial" w:hAnsi="Arial"/>
+                <w:b w:val="0"/>
+                <w:i w:val="0"/>
+                <w:color w:val="000000"/>
+                <w:sz w:val="18"/>
+              </w:rPr>
               <w:t>• Graphite: each carbon forms 3 covalent bonds in flat hexagonal layers; the 4th valence electron is delocalised and free to move between layers → conducts electricity. Layers are held by weak Van der Waals forces → layers slide over each other → soft and slippery.</w:t>
             </w:r>
           </w:p>
@@ -1119,7 +1454,7 @@
           </w:tcPr>
           <w:p>
             <w:pPr>
-              <w:spacing w:before="40" w:after="40"/>
+              <w:spacing w:before="20" w:after="20"/>
               <w:jc w:val="left"/>
             </w:pPr>
             <w:r>
@@ -1131,11 +1466,53 @@
                 <w:sz w:val="18"/>
               </w:rPr>
               <w:t>What is a dative covalent bond and how does it differ from a regular covalent bond?</w:t>
-              <w:br/>
+            </w:r>
+          </w:p>
+          <w:p>
+            <w:pPr>
+              <w:spacing w:before="20" w:after="20"/>
+              <w:jc w:val="left"/>
+            </w:pPr>
+            <w:r>
+              <w:rPr>
+                <w:rFonts w:ascii="Arial" w:hAnsi="Arial"/>
+                <w:b w:val="0"/>
+                <w:i w:val="0"/>
+                <w:color w:val="000000"/>
+                <w:sz w:val="18"/>
+              </w:rPr>
               <w:t>How do metallic bonds form and what properties do they give?</w:t>
-              <w:br/>
+            </w:r>
+          </w:p>
+          <w:p>
+            <w:pPr>
+              <w:spacing w:before="20" w:after="20"/>
+              <w:jc w:val="left"/>
+            </w:pPr>
+            <w:r>
+              <w:rPr>
+                <w:rFonts w:ascii="Arial" w:hAnsi="Arial"/>
+                <w:b w:val="0"/>
+                <w:i w:val="0"/>
+                <w:color w:val="000000"/>
+                <w:sz w:val="18"/>
+              </w:rPr>
               <w:t>What are hydrogen bonds and when do they form?</w:t>
-              <w:br/>
+            </w:r>
+          </w:p>
+          <w:p>
+            <w:pPr>
+              <w:spacing w:before="20" w:after="20"/>
+              <w:jc w:val="left"/>
+            </w:pPr>
+            <w:r>
+              <w:rPr>
+                <w:rFonts w:ascii="Arial" w:hAnsi="Arial"/>
+                <w:b w:val="0"/>
+                <w:i w:val="0"/>
+                <w:color w:val="000000"/>
+                <w:sz w:val="18"/>
+              </w:rPr>
               <w:t>What are Van der Waals forces and how do they affect properties?</w:t>
             </w:r>
           </w:p>
@@ -1149,7 +1526,7 @@
           </w:tcPr>
           <w:p>
             <w:pPr>
-              <w:spacing w:before="40" w:after="40"/>
+              <w:spacing w:before="20" w:after="20"/>
               <w:jc w:val="left"/>
             </w:pPr>
             <w:r>
@@ -1161,14 +1538,53 @@
                 <w:sz w:val="18"/>
               </w:rPr>
               <w:t>Dative covalent (coordinate) bond: both electrons in the shared pair come from the SAME atom (the donor). Example: the ammonium ion NH₄⁺ forms when NH₃ donates its lone pair to H⁺. Once formed, a dative bond is indistinguishable from a normal covalent bond.</w:t>
-              <w:br/>
-              <w:br/>
+            </w:r>
+          </w:p>
+          <w:p>
+            <w:pPr>
+              <w:spacing w:before="20" w:after="20"/>
+              <w:jc w:val="left"/>
+            </w:pPr>
+            <w:r>
+              <w:rPr>
+                <w:rFonts w:ascii="Arial" w:hAnsi="Arial"/>
+                <w:b w:val="0"/>
+                <w:i w:val="0"/>
+                <w:color w:val="000000"/>
+                <w:sz w:val="18"/>
+              </w:rPr>
               <w:t>Metallic bonds: metal atoms release their valence electrons into a 'sea' of delocalised electrons. The positive metal ions are held together by electrostatic attraction to the electron sea. This explains: high melting points (strong metallic bonds), electrical conductivity (delocalised electrons carry charge), malleability/ductility (layers of ions slide without breaking bonds), and metallic lustre.</w:t>
-              <w:br/>
-              <w:br/>
+            </w:r>
+          </w:p>
+          <w:p>
+            <w:pPr>
+              <w:spacing w:before="20" w:after="20"/>
+              <w:jc w:val="left"/>
+            </w:pPr>
+            <w:r>
+              <w:rPr>
+                <w:rFonts w:ascii="Arial" w:hAnsi="Arial"/>
+                <w:b w:val="0"/>
+                <w:i w:val="0"/>
+                <w:color w:val="000000"/>
+                <w:sz w:val="18"/>
+              </w:rPr>
               <w:t>Hydrogen bonds: a relatively strong intermolecular force forming between a δ+ hydrogen (bonded to N, O, or F) and a lone pair on N, O, or F of another molecule. They are NOT covalent bonds — they are between molecules. Hydrogen bonds give water its unusually high boiling point, surface tension, and solvent properties.</w:t>
-              <w:br/>
-              <w:br/>
+            </w:r>
+          </w:p>
+          <w:p>
+            <w:pPr>
+              <w:spacing w:before="20" w:after="20"/>
+              <w:jc w:val="left"/>
+            </w:pPr>
+            <w:r>
+              <w:rPr>
+                <w:rFonts w:ascii="Arial" w:hAnsi="Arial"/>
+                <w:b w:val="0"/>
+                <w:i w:val="0"/>
+                <w:color w:val="000000"/>
+                <w:sz w:val="18"/>
+              </w:rPr>
               <w:t>Van der Waals forces: temporary dipoles caused by uneven electron distribution create weak attractions between all molecules. Stronger for larger molecules (more electrons). Explains why simple molecular substances have low but non-zero melting/boiling points.</w:t>
             </w:r>
           </w:p>
@@ -1230,7 +1646,7 @@
           </w:tcPr>
           <w:p>
             <w:pPr>
-              <w:spacing w:before="40" w:after="40"/>
+              <w:spacing w:before="20" w:after="20"/>
               <w:jc w:val="left"/>
             </w:pPr>
             <w:r>
@@ -1242,9 +1658,37 @@
                 <w:sz w:val="18"/>
               </w:rPr>
               <w:t>Create a comparison table of ionic, simple molecular, giant covalent, and metallic substances (covering melting point, conductivity, hardness, solubility).</w:t>
-              <w:br/>
+            </w:r>
+          </w:p>
+          <w:p>
+            <w:pPr>
+              <w:spacing w:before="20" w:after="20"/>
+              <w:jc w:val="left"/>
+            </w:pPr>
+            <w:r>
+              <w:rPr>
+                <w:rFonts w:ascii="Arial" w:hAnsi="Arial"/>
+                <w:b w:val="0"/>
+                <w:i w:val="0"/>
+                <w:color w:val="000000"/>
+                <w:sz w:val="18"/>
+              </w:rPr>
               <w:t>Choose at least 4 substances and explain how their bonding and structure make them suitable for their uses (e.g. NaCl, diamond, graphite, copper, water).</w:t>
-              <w:br/>
+            </w:r>
+          </w:p>
+          <w:p>
+            <w:pPr>
+              <w:spacing w:before="20" w:after="20"/>
+              <w:jc w:val="left"/>
+            </w:pPr>
+            <w:r>
+              <w:rPr>
+                <w:rFonts w:ascii="Arial" w:hAnsi="Arial"/>
+                <w:b w:val="0"/>
+                <w:i w:val="0"/>
+                <w:color w:val="000000"/>
+                <w:sz w:val="18"/>
+              </w:rPr>
               <w:t>Answer the driving question: How do the bonds between atoms determine the properties and uses of substances?</w:t>
             </w:r>
           </w:p>
@@ -1258,7 +1702,23 @@
           </w:tcPr>
           <w:p>
             <w:pPr>
-              <w:spacing w:before="40" w:after="40"/>
+              <w:spacing w:before="20" w:after="20"/>
+              <w:jc w:val="left"/>
+            </w:pPr>
+            <w:r>
+              <w:rPr>
+                <w:rFonts w:ascii="Arial" w:hAnsi="Arial"/>
+                <w:b/>
+                <w:i w:val="0"/>
+                <w:color w:val="000000"/>
+                <w:sz w:val="18"/>
+              </w:rPr>
+              <w:t>Comparison Table:</w:t>
+            </w:r>
+          </w:p>
+          <w:p>
+            <w:pPr>
+              <w:spacing w:before="20" w:after="20"/>
               <w:jc w:val="left"/>
             </w:pPr>
             <w:r>
@@ -1269,30 +1729,170 @@
                 <w:color w:val="000000"/>
                 <w:sz w:val="18"/>
               </w:rPr>
-              <w:t>Comparison Table:</w:t>
-              <w:br/>
               <w:t>| Type | Example | M.Pt | Electricity | Hardness | Water Solubility |</w:t>
-              <w:br/>
+            </w:r>
+          </w:p>
+          <w:p>
+            <w:pPr>
+              <w:spacing w:before="20" w:after="20"/>
+              <w:jc w:val="left"/>
+            </w:pPr>
+            <w:r>
+              <w:rPr>
+                <w:rFonts w:ascii="Arial" w:hAnsi="Arial"/>
+                <w:b w:val="0"/>
+                <w:i w:val="0"/>
+                <w:color w:val="000000"/>
+                <w:sz w:val="18"/>
+              </w:rPr>
               <w:t>| Ionic | NaCl | High | Yes (aq/l) | Hard, brittle | Soluble |</w:t>
-              <w:br/>
+            </w:r>
+          </w:p>
+          <w:p>
+            <w:pPr>
+              <w:spacing w:before="20" w:after="20"/>
+              <w:jc w:val="left"/>
+            </w:pPr>
+            <w:r>
+              <w:rPr>
+                <w:rFonts w:ascii="Arial" w:hAnsi="Arial"/>
+                <w:b w:val="0"/>
+                <w:i w:val="0"/>
+                <w:color w:val="000000"/>
+                <w:sz w:val="18"/>
+              </w:rPr>
               <w:t>| Simple Molecular | H₂O | Low | No | Soft | Variable |</w:t>
-              <w:br/>
+            </w:r>
+          </w:p>
+          <w:p>
+            <w:pPr>
+              <w:spacing w:before="20" w:after="20"/>
+              <w:jc w:val="left"/>
+            </w:pPr>
+            <w:r>
+              <w:rPr>
+                <w:rFonts w:ascii="Arial" w:hAnsi="Arial"/>
+                <w:b w:val="0"/>
+                <w:i w:val="0"/>
+                <w:color w:val="000000"/>
+                <w:sz w:val="18"/>
+              </w:rPr>
               <w:t>| Giant Covalent | Diamond | Very high | No (except graphite) | Very hard | Insoluble |</w:t>
-              <w:br/>
+            </w:r>
+          </w:p>
+          <w:p>
+            <w:pPr>
+              <w:spacing w:before="20" w:after="20"/>
+              <w:jc w:val="left"/>
+            </w:pPr>
+            <w:r>
+              <w:rPr>
+                <w:rFonts w:ascii="Arial" w:hAnsi="Arial"/>
+                <w:b w:val="0"/>
+                <w:i w:val="0"/>
+                <w:color w:val="000000"/>
+                <w:sz w:val="18"/>
+              </w:rPr>
               <w:t>| Metallic | Copper | High | Yes | Hard, malleable | Insoluble |</w:t>
-              <w:br/>
-              <w:br/>
+            </w:r>
+          </w:p>
+          <w:p>
+            <w:pPr>
+              <w:spacing w:before="20" w:after="20"/>
+              <w:jc w:val="left"/>
+            </w:pPr>
+            <w:r>
+              <w:rPr>
+                <w:rFonts w:ascii="Arial" w:hAnsi="Arial"/>
+                <w:b/>
+                <w:i w:val="0"/>
+                <w:color w:val="000000"/>
+                <w:sz w:val="18"/>
+              </w:rPr>
               <w:t>Applications:</w:t>
-              <w:br/>
+            </w:r>
+          </w:p>
+          <w:p>
+            <w:pPr>
+              <w:spacing w:before="20" w:after="20"/>
+              <w:ind w:left="240"/>
+              <w:jc w:val="left"/>
+            </w:pPr>
+            <w:r>
+              <w:rPr>
+                <w:rFonts w:ascii="Arial" w:hAnsi="Arial"/>
+                <w:b w:val="0"/>
+                <w:i w:val="0"/>
+                <w:color w:val="000000"/>
+                <w:sz w:val="18"/>
+              </w:rPr>
               <w:t>• NaCl: used as food preservative and in medicine (saline drips) — dissolves in water, safe for consumption.</w:t>
-              <w:br/>
+            </w:r>
+          </w:p>
+          <w:p>
+            <w:pPr>
+              <w:spacing w:before="20" w:after="20"/>
+              <w:ind w:left="240"/>
+              <w:jc w:val="left"/>
+            </w:pPr>
+            <w:r>
+              <w:rPr>
+                <w:rFonts w:ascii="Arial" w:hAnsi="Arial"/>
+                <w:b w:val="0"/>
+                <w:i w:val="0"/>
+                <w:color w:val="000000"/>
+                <w:sz w:val="18"/>
+              </w:rPr>
               <w:t>• Diamond: used in cutting tools and drill bits — hardest natural substance due to strong 3D covalent network.</w:t>
-              <w:br/>
+            </w:r>
+          </w:p>
+          <w:p>
+            <w:pPr>
+              <w:spacing w:before="20" w:after="20"/>
+              <w:ind w:left="240"/>
+              <w:jc w:val="left"/>
+            </w:pPr>
+            <w:r>
+              <w:rPr>
+                <w:rFonts w:ascii="Arial" w:hAnsi="Arial"/>
+                <w:b w:val="0"/>
+                <w:i w:val="0"/>
+                <w:color w:val="000000"/>
+                <w:sz w:val="18"/>
+              </w:rPr>
               <w:t>• Graphite: used in pencils and as electrodes — soft (layers slide) and conducts electricity (delocalised electrons).</w:t>
-              <w:br/>
+            </w:r>
+          </w:p>
+          <w:p>
+            <w:pPr>
+              <w:spacing w:before="20" w:after="20"/>
+              <w:ind w:left="240"/>
+              <w:jc w:val="left"/>
+            </w:pPr>
+            <w:r>
+              <w:rPr>
+                <w:rFonts w:ascii="Arial" w:hAnsi="Arial"/>
+                <w:b w:val="0"/>
+                <w:i w:val="0"/>
+                <w:color w:val="000000"/>
+                <w:sz w:val="18"/>
+              </w:rPr>
               <w:t>• Copper: used in electrical wiring — excellent conductor, malleable, does not corrode easily.</w:t>
-              <w:br/>
-              <w:br/>
+            </w:r>
+          </w:p>
+          <w:p>
+            <w:pPr>
+              <w:spacing w:before="20" w:after="20"/>
+              <w:jc w:val="left"/>
+            </w:pPr>
+            <w:r>
+              <w:rPr>
+                <w:rFonts w:ascii="Arial" w:hAnsi="Arial"/>
+                <w:b w:val="0"/>
+                <w:i w:val="0"/>
+                <w:color w:val="000000"/>
+                <w:sz w:val="18"/>
+              </w:rPr>
               <w:t>Driving Question Answer: The bonds between atoms determine atomic/molecular structure, which directly controls macroscopic properties. Diamond and graphite are both pure carbon — but in diamond, each carbon forms 4 bonds in a 3D tetrahedral network (making it the hardest substance), while in graphite, each carbon forms 3 bonds in flat layers with delocalised electrons (making it soft and conductive). The bond type IS the structure IS the property.</w:t>
             </w:r>
           </w:p>
@@ -1354,7 +1954,7 @@
           </w:tcPr>
           <w:p>
             <w:pPr>
-              <w:spacing w:before="40" w:after="40"/>
+              <w:spacing w:before="20" w:after="20"/>
               <w:jc w:val="left"/>
             </w:pPr>
             <w:r>
@@ -1366,11 +1966,53 @@
                 <w:sz w:val="18"/>
               </w:rPr>
               <w:t>How do the properties of substances determine their uses?</w:t>
-              <w:br/>
+            </w:r>
+          </w:p>
+          <w:p>
+            <w:pPr>
+              <w:spacing w:before="20" w:after="20"/>
+              <w:jc w:val="left"/>
+            </w:pPr>
+            <w:r>
+              <w:rPr>
+                <w:rFonts w:ascii="Arial" w:hAnsi="Arial"/>
+                <w:b w:val="0"/>
+                <w:i w:val="0"/>
+                <w:color w:val="000000"/>
+                <w:sz w:val="18"/>
+              </w:rPr>
               <w:t>Can you explain specific real-world applications using bonding concepts?</w:t>
-              <w:br/>
+            </w:r>
+          </w:p>
+          <w:p>
+            <w:pPr>
+              <w:spacing w:before="20" w:after="20"/>
+              <w:jc w:val="left"/>
+            </w:pPr>
+            <w:r>
+              <w:rPr>
+                <w:rFonts w:ascii="Arial" w:hAnsi="Arial"/>
+                <w:b w:val="0"/>
+                <w:i w:val="0"/>
+                <w:color w:val="000000"/>
+                <w:sz w:val="18"/>
+              </w:rPr>
               <w:t>Choose at least 4 substances and explain how their bonding and structure make them suitable for their uses.</w:t>
-              <w:br/>
+            </w:r>
+          </w:p>
+          <w:p>
+            <w:pPr>
+              <w:spacing w:before="20" w:after="20"/>
+              <w:jc w:val="left"/>
+            </w:pPr>
+            <w:r>
+              <w:rPr>
+                <w:rFonts w:ascii="Arial" w:hAnsi="Arial"/>
+                <w:b w:val="0"/>
+                <w:i w:val="0"/>
+                <w:color w:val="000000"/>
+                <w:sz w:val="18"/>
+              </w:rPr>
               <w:t>For each substance explain: what type of bonding it has; what structure this creates; what properties result; how these properties make it useful.</w:t>
             </w:r>
           </w:p>
@@ -1384,7 +2026,39 @@
           </w:tcPr>
           <w:p>
             <w:pPr>
-              <w:spacing w:before="40" w:after="40"/>
+              <w:spacing w:before="20" w:after="20"/>
+              <w:jc w:val="left"/>
+            </w:pPr>
+            <w:r>
+              <w:rPr>
+                <w:rFonts w:ascii="Arial" w:hAnsi="Arial"/>
+                <w:b/>
+                <w:i w:val="0"/>
+                <w:color w:val="000000"/>
+                <w:sz w:val="18"/>
+              </w:rPr>
+              <w:t>Substance Applications:</w:t>
+            </w:r>
+          </w:p>
+          <w:p>
+            <w:pPr>
+              <w:spacing w:before="20" w:after="20"/>
+              <w:jc w:val="left"/>
+            </w:pPr>
+            <w:r>
+              <w:rPr>
+                <w:rFonts w:ascii="Arial" w:hAnsi="Arial"/>
+                <w:b/>
+                <w:i w:val="0"/>
+                <w:color w:val="000000"/>
+                <w:sz w:val="18"/>
+              </w:rPr>
+              <w:t>Sodium chloride (NaCl) — Table salt and de-icing roads:</w:t>
+            </w:r>
+          </w:p>
+          <w:p>
+            <w:pPr>
+              <w:spacing w:before="20" w:after="20"/>
               <w:jc w:val="left"/>
             </w:pPr>
             <w:r>
@@ -1395,36 +2069,166 @@
                 <w:color w:val="000000"/>
                 <w:sz w:val="18"/>
               </w:rPr>
-              <w:t>Substance Applications:</w:t>
-              <w:br/>
-              <w:br/>
-              <w:t>Sodium chloride (NaCl) — Table salt and de-icing roads:</w:t>
-              <w:br/>
               <w:t>Ionic bonding → giant ionic lattice → soluble in water (ions dissociate), safe to consume, lowers freezing point of water. Used as food preservative, in oral rehydration salts (saline drips), and to melt ice on roads in cold climates.</w:t>
-              <w:br/>
-              <w:br/>
+            </w:r>
+          </w:p>
+          <w:p>
+            <w:pPr>
+              <w:spacing w:before="20" w:after="20"/>
+              <w:jc w:val="left"/>
+            </w:pPr>
+            <w:r>
+              <w:rPr>
+                <w:rFonts w:ascii="Arial" w:hAnsi="Arial"/>
+                <w:b/>
+                <w:i w:val="0"/>
+                <w:color w:val="000000"/>
+                <w:sz w:val="18"/>
+              </w:rPr>
               <w:t>Diamond — Cutting tools, drill bits, jewelry:</w:t>
-              <w:br/>
+            </w:r>
+          </w:p>
+          <w:p>
+            <w:pPr>
+              <w:spacing w:before="20" w:after="20"/>
+              <w:jc w:val="left"/>
+            </w:pPr>
+            <w:r>
+              <w:rPr>
+                <w:rFonts w:ascii="Arial" w:hAnsi="Arial"/>
+                <w:b w:val="0"/>
+                <w:i w:val="0"/>
+                <w:color w:val="000000"/>
+                <w:sz w:val="18"/>
+              </w:rPr>
               <w:t>Giant covalent structure — each carbon bonded to 4 others in a 3D tetrahedral network → all bonds must break to scratch or melt it → extremely hard (hardest natural substance, Mohs 10) and very high melting point. Used in industrial cutting tools, drill bits for oil exploration, and gemstones.</w:t>
-              <w:br/>
-              <w:br/>
+            </w:r>
+          </w:p>
+          <w:p>
+            <w:pPr>
+              <w:spacing w:before="20" w:after="20"/>
+              <w:jc w:val="left"/>
+            </w:pPr>
+            <w:r>
+              <w:rPr>
+                <w:rFonts w:ascii="Arial" w:hAnsi="Arial"/>
+                <w:b/>
+                <w:i w:val="0"/>
+                <w:color w:val="000000"/>
+                <w:sz w:val="18"/>
+              </w:rPr>
               <w:t>Graphite — Pencil leads, lubricants, electrodes:</w:t>
-              <w:br/>
+            </w:r>
+          </w:p>
+          <w:p>
+            <w:pPr>
+              <w:spacing w:before="20" w:after="20"/>
+              <w:jc w:val="left"/>
+            </w:pPr>
+            <w:r>
+              <w:rPr>
+                <w:rFonts w:ascii="Arial" w:hAnsi="Arial"/>
+                <w:b w:val="0"/>
+                <w:i w:val="0"/>
+                <w:color w:val="000000"/>
+                <w:sz w:val="18"/>
+              </w:rPr>
               <w:t>Layered giant covalent structure — each carbon forms 3 bonds in flat hexagonal layers; one delocalised electron per carbon moves freely between layers → conducts electricity; layers held by weak Van der Waals forces → slide easily (soft and lubricating). Used in pencil leads (leaves a mark when layers slide onto paper), industrial lubricants, and as electrodes in electrolysis.</w:t>
-              <w:br/>
-              <w:br/>
+            </w:r>
+          </w:p>
+          <w:p>
+            <w:pPr>
+              <w:spacing w:before="20" w:after="20"/>
+              <w:jc w:val="left"/>
+            </w:pPr>
+            <w:r>
+              <w:rPr>
+                <w:rFonts w:ascii="Arial" w:hAnsi="Arial"/>
+                <w:b w:val="0"/>
+                <w:i w:val="0"/>
+                <w:color w:val="000000"/>
+                <w:sz w:val="18"/>
+              </w:rPr>
               <w:t>Metals (copper, aluminium, iron) — Electrical wiring, construction, cookware:</w:t>
-              <w:br/>
+            </w:r>
+          </w:p>
+          <w:p>
+            <w:pPr>
+              <w:spacing w:before="20" w:after="20"/>
+              <w:jc w:val="left"/>
+            </w:pPr>
+            <w:r>
+              <w:rPr>
+                <w:rFonts w:ascii="Arial" w:hAnsi="Arial"/>
+                <w:b w:val="0"/>
+                <w:i w:val="0"/>
+                <w:color w:val="000000"/>
+                <w:sz w:val="18"/>
+              </w:rPr>
               <w:t>Metallic bonding — sea of delocalised electrons around positive metal ions → electrons carry charge freely (excellent conductor); ions can slide past each other (malleable and ductile); strong metallic bonds → high melting points and structural strength.</w:t>
-              <w:br/>
-              <w:br/>
+            </w:r>
+          </w:p>
+          <w:p>
+            <w:pPr>
+              <w:spacing w:before="20" w:after="20"/>
+              <w:jc w:val="left"/>
+            </w:pPr>
+            <w:r>
+              <w:rPr>
+                <w:rFonts w:ascii="Arial" w:hAnsi="Arial"/>
+                <w:b/>
+                <w:i w:val="0"/>
+                <w:color w:val="000000"/>
+                <w:sz w:val="18"/>
+              </w:rPr>
               <w:t>Water (H₂O) — Universal solvent, biological processes:</w:t>
-              <w:br/>
+            </w:r>
+          </w:p>
+          <w:p>
+            <w:pPr>
+              <w:spacing w:before="20" w:after="20"/>
+              <w:jc w:val="left"/>
+            </w:pPr>
+            <w:r>
+              <w:rPr>
+                <w:rFonts w:ascii="Arial" w:hAnsi="Arial"/>
+                <w:b w:val="0"/>
+                <w:i w:val="0"/>
+                <w:color w:val="000000"/>
+                <w:sz w:val="18"/>
+              </w:rPr>
               <w:t>Polar covalent bonds + hydrogen bonding between molecules → unusually high boiling point for such a small molecule (100°C), remains liquid at room temperature, excellent solvent for ionic and polar substances. Essential for life and all biochemical reactions.</w:t>
-              <w:br/>
-              <w:br/>
+            </w:r>
+          </w:p>
+          <w:p>
+            <w:pPr>
+              <w:spacing w:before="20" w:after="20"/>
+              <w:jc w:val="left"/>
+            </w:pPr>
+            <w:r>
+              <w:rPr>
+                <w:rFonts w:ascii="Arial" w:hAnsi="Arial"/>
+                <w:b/>
+                <w:i w:val="0"/>
+                <w:color w:val="000000"/>
+                <w:sz w:val="18"/>
+              </w:rPr>
               <w:t>Silicon dioxide (SiO₂) — Glass, electronics, construction:</w:t>
-              <w:br/>
+            </w:r>
+          </w:p>
+          <w:p>
+            <w:pPr>
+              <w:spacing w:before="20" w:after="20"/>
+              <w:jc w:val="left"/>
+            </w:pPr>
+            <w:r>
+              <w:rPr>
+                <w:rFonts w:ascii="Arial" w:hAnsi="Arial"/>
+                <w:b w:val="0"/>
+                <w:i w:val="0"/>
+                <w:color w:val="000000"/>
+                <w:sz w:val="18"/>
+              </w:rPr>
               <w:t>Giant covalent structure (like diamond but with O atoms between Si atoms) → very hard, very high melting point (~1700°C), transparent when pure, chemically inert. Used in glass making, optical fibres, microchip substrates, and as a construction material (sand, concrete).</w:t>
             </w:r>
           </w:p>
@@ -1625,7 +2429,7 @@
           </w:tcPr>
           <w:p>
             <w:pPr>
-              <w:spacing w:before="40" w:after="40"/>
+              <w:spacing w:before="20" w:after="20"/>
               <w:jc w:val="left"/>
             </w:pPr>
             <w:r>
@@ -1647,7 +2451,7 @@
           </w:tcPr>
           <w:p>
             <w:pPr>
-              <w:spacing w:before="40" w:after="40"/>
+              <w:spacing w:before="20" w:after="20"/>
               <w:jc w:val="left"/>
             </w:pPr>
             <w:r>
@@ -1669,7 +2473,7 @@
           </w:tcPr>
           <w:p>
             <w:pPr>
-              <w:spacing w:before="40" w:after="40"/>
+              <w:spacing w:before="20" w:after="20"/>
               <w:jc w:val="left"/>
             </w:pPr>
             <w:r>
@@ -1691,7 +2495,7 @@
           </w:tcPr>
           <w:p>
             <w:pPr>
-              <w:spacing w:before="40" w:after="40"/>
+              <w:spacing w:before="20" w:after="20"/>
               <w:jc w:val="left"/>
             </w:pPr>
             <w:r>
@@ -1737,7 +2541,7 @@
           </w:tcPr>
           <w:p>
             <w:pPr>
-              <w:spacing w:before="40" w:after="40"/>
+              <w:spacing w:before="20" w:after="20"/>
               <w:jc w:val="left"/>
             </w:pPr>
             <w:r>
@@ -1759,7 +2563,7 @@
           </w:tcPr>
           <w:p>
             <w:pPr>
-              <w:spacing w:before="40" w:after="40"/>
+              <w:spacing w:before="20" w:after="20"/>
               <w:jc w:val="left"/>
             </w:pPr>
             <w:r>
@@ -1781,7 +2585,7 @@
           </w:tcPr>
           <w:p>
             <w:pPr>
-              <w:spacing w:before="40" w:after="40"/>
+              <w:spacing w:before="20" w:after="20"/>
               <w:jc w:val="left"/>
             </w:pPr>
             <w:r>
@@ -1803,7 +2607,7 @@
           </w:tcPr>
           <w:p>
             <w:pPr>
-              <w:spacing w:before="40" w:after="40"/>
+              <w:spacing w:before="20" w:after="20"/>
               <w:jc w:val="left"/>
             </w:pPr>
             <w:r>
@@ -1849,7 +2653,7 @@
           </w:tcPr>
           <w:p>
             <w:pPr>
-              <w:spacing w:before="40" w:after="40"/>
+              <w:spacing w:before="20" w:after="20"/>
               <w:jc w:val="left"/>
             </w:pPr>
             <w:r>
@@ -1871,7 +2675,7 @@
           </w:tcPr>
           <w:p>
             <w:pPr>
-              <w:spacing w:before="40" w:after="40"/>
+              <w:spacing w:before="20" w:after="20"/>
               <w:jc w:val="left"/>
             </w:pPr>
             <w:r>
@@ -1893,7 +2697,7 @@
           </w:tcPr>
           <w:p>
             <w:pPr>
-              <w:spacing w:before="40" w:after="40"/>
+              <w:spacing w:before="20" w:after="20"/>
               <w:jc w:val="left"/>
             </w:pPr>
             <w:r>
@@ -1915,7 +2719,7 @@
           </w:tcPr>
           <w:p>
             <w:pPr>
-              <w:spacing w:before="40" w:after="40"/>
+              <w:spacing w:before="20" w:after="20"/>
               <w:jc w:val="left"/>
             </w:pPr>
             <w:r>
@@ -1961,7 +2765,7 @@
           </w:tcPr>
           <w:p>
             <w:pPr>
-              <w:spacing w:before="40" w:after="40"/>
+              <w:spacing w:before="20" w:after="20"/>
               <w:jc w:val="left"/>
             </w:pPr>
             <w:r>
@@ -1983,7 +2787,7 @@
           </w:tcPr>
           <w:p>
             <w:pPr>
-              <w:spacing w:before="40" w:after="40"/>
+              <w:spacing w:before="20" w:after="20"/>
               <w:jc w:val="left"/>
             </w:pPr>
             <w:r>
@@ -2005,7 +2809,7 @@
           </w:tcPr>
           <w:p>
             <w:pPr>
-              <w:spacing w:before="40" w:after="40"/>
+              <w:spacing w:before="20" w:after="20"/>
               <w:jc w:val="left"/>
             </w:pPr>
             <w:r>
@@ -2027,7 +2831,7 @@
           </w:tcPr>
           <w:p>
             <w:pPr>
-              <w:spacing w:before="40" w:after="40"/>
+              <w:spacing w:before="20" w:after="20"/>
               <w:jc w:val="left"/>
             </w:pPr>
             <w:r>
@@ -2073,7 +2877,7 @@
           </w:tcPr>
           <w:p>
             <w:pPr>
-              <w:spacing w:before="40" w:after="40"/>
+              <w:spacing w:before="20" w:after="20"/>
               <w:jc w:val="left"/>
             </w:pPr>
             <w:r>
@@ -2095,7 +2899,7 @@
           </w:tcPr>
           <w:p>
             <w:pPr>
-              <w:spacing w:before="40" w:after="40"/>
+              <w:spacing w:before="20" w:after="20"/>
               <w:jc w:val="left"/>
             </w:pPr>
             <w:r>
@@ -2117,7 +2921,7 @@
           </w:tcPr>
           <w:p>
             <w:pPr>
-              <w:spacing w:before="40" w:after="40"/>
+              <w:spacing w:before="20" w:after="20"/>
               <w:jc w:val="left"/>
             </w:pPr>
             <w:r>
@@ -2139,7 +2943,7 @@
           </w:tcPr>
           <w:p>
             <w:pPr>
-              <w:spacing w:before="40" w:after="40"/>
+              <w:spacing w:before="20" w:after="20"/>
               <w:jc w:val="left"/>
             </w:pPr>
             <w:r>
@@ -2185,7 +2989,7 @@
           </w:tcPr>
           <w:p>
             <w:pPr>
-              <w:spacing w:before="40" w:after="40"/>
+              <w:spacing w:before="20" w:after="20"/>
               <w:jc w:val="left"/>
             </w:pPr>
             <w:r>
@@ -2207,7 +3011,7 @@
           </w:tcPr>
           <w:p>
             <w:pPr>
-              <w:spacing w:before="40" w:after="40"/>
+              <w:spacing w:before="20" w:after="20"/>
               <w:jc w:val="left"/>
             </w:pPr>
             <w:r>
@@ -2229,7 +3033,7 @@
           </w:tcPr>
           <w:p>
             <w:pPr>
-              <w:spacing w:before="40" w:after="40"/>
+              <w:spacing w:before="20" w:after="20"/>
               <w:jc w:val="left"/>
             </w:pPr>
             <w:r>
@@ -2251,7 +3055,7 @@
           </w:tcPr>
           <w:p>
             <w:pPr>
-              <w:spacing w:before="40" w:after="40"/>
+              <w:spacing w:before="20" w:after="20"/>
               <w:jc w:val="left"/>
             </w:pPr>
             <w:r>
@@ -2297,7 +3101,7 @@
           </w:tcPr>
           <w:p>
             <w:pPr>
-              <w:spacing w:before="40" w:after="40"/>
+              <w:spacing w:before="20" w:after="20"/>
               <w:jc w:val="left"/>
             </w:pPr>
             <w:r>
@@ -2319,7 +3123,7 @@
           </w:tcPr>
           <w:p>
             <w:pPr>
-              <w:spacing w:before="40" w:after="40"/>
+              <w:spacing w:before="20" w:after="20"/>
               <w:jc w:val="left"/>
             </w:pPr>
             <w:r>
@@ -2341,7 +3145,7 @@
           </w:tcPr>
           <w:p>
             <w:pPr>
-              <w:spacing w:before="40" w:after="40"/>
+              <w:spacing w:before="20" w:after="20"/>
               <w:jc w:val="left"/>
             </w:pPr>
             <w:r>
@@ -2363,7 +3167,7 @@
           </w:tcPr>
           <w:p>
             <w:pPr>
-              <w:spacing w:before="40" w:after="40"/>
+              <w:spacing w:before="20" w:after="20"/>
               <w:jc w:val="left"/>
             </w:pPr>
             <w:r>
@@ -2409,7 +3213,7 @@
           </w:tcPr>
           <w:p>
             <w:pPr>
-              <w:spacing w:before="40" w:after="40"/>
+              <w:spacing w:before="20" w:after="20"/>
               <w:jc w:val="left"/>
             </w:pPr>
             <w:r>
@@ -2431,7 +3235,7 @@
           </w:tcPr>
           <w:p>
             <w:pPr>
-              <w:spacing w:before="40" w:after="40"/>
+              <w:spacing w:before="20" w:after="20"/>
               <w:jc w:val="left"/>
             </w:pPr>
             <w:r>
@@ -2453,7 +3257,7 @@
           </w:tcPr>
           <w:p>
             <w:pPr>
-              <w:spacing w:before="40" w:after="40"/>
+              <w:spacing w:before="20" w:after="20"/>
               <w:jc w:val="left"/>
             </w:pPr>
             <w:r>
@@ -2475,7 +3279,7 @@
           </w:tcPr>
           <w:p>
             <w:pPr>
-              <w:spacing w:before="40" w:after="40"/>
+              <w:spacing w:before="20" w:after="20"/>
               <w:jc w:val="left"/>
             </w:pPr>
             <w:r>

</xml_diff>

<commit_message>
Round 4 formatting fixes: SLO bullets, FE sub-headers, summary table bullets
- Apply _to_slo_list() to Table A SLO cells (Knowledge/Skills/Attitudes)
  so multi-line entries render as bullet lists
- Add parse_framework_sections() to extract per-section content from source
  Final Explanation docs — preserves "Guiding Questions:", "What to Include:",
  "Suggested Diagrams:" sub-headers by parsing H3 structure with _text_to_rich()
- Use parsed Framework sections in build_final_explanation_docx() instead of
  hardcoded META prompts; fall back to META if parse returns nothing
- Add _prose_to_bullets() helper that splits multi-sentence prose into bullets
  using sentence-boundary detection ('. [A-Z]' pattern)
- Apply _prose_to_bullets() to Summary Table data columns 2-5
- Add _tbl_no_spacing() spacer between Assessment Rubric and Example section

https://claude.ai/code/session_01J9jEA4DnFx8YWZJcajHJKQ
</commit_message>
<xml_diff>
--- a/data/outputs/Seavuria_Reformatted/Chemistry_10_SubStrand1.4_ChemicalBonding_FinalExplanation.docx
+++ b/data/outputs/Seavuria_Reformatted/Chemistry_10_SubStrand1.4_ChemicalBonding_FinalExplanation.docx
@@ -1083,6 +1083,22 @@
           <w:p>
             <w:pPr>
               <w:spacing w:before="20" w:after="20"/>
+              <w:jc w:val="left"/>
+            </w:pPr>
+            <w:r>
+              <w:rPr>
+                <w:rFonts w:ascii="Arial" w:hAnsi="Arial"/>
+                <w:b/>
+                <w:i w:val="0"/>
+                <w:color w:val="000000"/>
+                <w:sz w:val="18"/>
+              </w:rPr>
+              <w:t>Guiding Questions:</w:t>
+            </w:r>
+          </w:p>
+          <w:p>
+            <w:pPr>
+              <w:spacing w:before="20" w:after="20"/>
               <w:ind w:left="240"/>
               <w:jc w:val="left"/>
             </w:pPr>
@@ -1146,6 +1162,140 @@
                 <w:sz w:val="18"/>
               </w:rPr>
               <w:t>• How does bonding help atoms achieve stability?</w:t>
+            </w:r>
+          </w:p>
+          <w:p>
+            <w:pPr>
+              <w:spacing w:before="20" w:after="20"/>
+              <w:jc w:val="left"/>
+            </w:pPr>
+            <w:r>
+              <w:rPr>
+                <w:rFonts w:ascii="Arial" w:hAnsi="Arial"/>
+                <w:b/>
+                <w:i w:val="0"/>
+                <w:color w:val="000000"/>
+                <w:sz w:val="18"/>
+              </w:rPr>
+              <w:t>What to Include:</w:t>
+            </w:r>
+          </w:p>
+          <w:p>
+            <w:pPr>
+              <w:spacing w:before="20" w:after="20"/>
+              <w:ind w:left="240"/>
+              <w:jc w:val="left"/>
+            </w:pPr>
+            <w:r>
+              <w:rPr>
+                <w:rFonts w:ascii="Arial" w:hAnsi="Arial"/>
+                <w:b w:val="0"/>
+                <w:i w:val="0"/>
+                <w:color w:val="000000"/>
+                <w:sz w:val="18"/>
+              </w:rPr>
+              <w:t>• Explanation of electron shell structure and valence electrons</w:t>
+            </w:r>
+          </w:p>
+          <w:p>
+            <w:pPr>
+              <w:spacing w:before="20" w:after="20"/>
+              <w:ind w:left="240"/>
+              <w:jc w:val="left"/>
+            </w:pPr>
+            <w:r>
+              <w:rPr>
+                <w:rFonts w:ascii="Arial" w:hAnsi="Arial"/>
+                <w:b w:val="0"/>
+                <w:i w:val="0"/>
+                <w:color w:val="000000"/>
+                <w:sz w:val="18"/>
+              </w:rPr>
+              <w:t>• The relationship between stability and filled outer shells</w:t>
+            </w:r>
+          </w:p>
+          <w:p>
+            <w:pPr>
+              <w:spacing w:before="20" w:after="20"/>
+              <w:ind w:left="240"/>
+              <w:jc w:val="left"/>
+            </w:pPr>
+            <w:r>
+              <w:rPr>
+                <w:rFonts w:ascii="Arial" w:hAnsi="Arial"/>
+                <w:b w:val="0"/>
+                <w:i w:val="0"/>
+                <w:color w:val="000000"/>
+                <w:sz w:val="18"/>
+              </w:rPr>
+              <w:t>• The octet rule (8 electrons) and duplet rule (2 electrons for hydrogen and helium)</w:t>
+            </w:r>
+          </w:p>
+          <w:p>
+            <w:pPr>
+              <w:spacing w:before="20" w:after="20"/>
+              <w:ind w:left="240"/>
+              <w:jc w:val="left"/>
+            </w:pPr>
+            <w:r>
+              <w:rPr>
+                <w:rFonts w:ascii="Arial" w:hAnsi="Arial"/>
+                <w:b w:val="0"/>
+                <w:i w:val="0"/>
+                <w:color w:val="000000"/>
+                <w:sz w:val="18"/>
+              </w:rPr>
+              <w:t>• Why atoms bond: to achieve noble gas electron configurations</w:t>
+            </w:r>
+          </w:p>
+          <w:p>
+            <w:pPr>
+              <w:spacing w:before="20" w:after="20"/>
+              <w:ind w:left="240"/>
+              <w:jc w:val="left"/>
+            </w:pPr>
+            <w:r>
+              <w:rPr>
+                <w:rFonts w:ascii="Arial" w:hAnsi="Arial"/>
+                <w:b w:val="0"/>
+                <w:i w:val="0"/>
+                <w:color w:val="000000"/>
+                <w:sz w:val="18"/>
+              </w:rPr>
+              <w:t>• Examples of stable vs. unstable atoms</w:t>
+            </w:r>
+          </w:p>
+          <w:p>
+            <w:pPr>
+              <w:spacing w:before="20" w:after="20"/>
+              <w:jc w:val="left"/>
+            </w:pPr>
+            <w:r>
+              <w:rPr>
+                <w:rFonts w:ascii="Arial" w:hAnsi="Arial"/>
+                <w:b/>
+                <w:i w:val="0"/>
+                <w:color w:val="000000"/>
+                <w:sz w:val="18"/>
+              </w:rPr>
+              <w:t>Suggested Diagrams:</w:t>
+            </w:r>
+          </w:p>
+          <w:p>
+            <w:pPr>
+              <w:spacing w:before="20" w:after="20"/>
+              <w:ind w:left="240"/>
+              <w:jc w:val="left"/>
+            </w:pPr>
+            <w:r>
+              <w:rPr>
+                <w:rFonts w:ascii="Arial" w:hAnsi="Arial"/>
+                <w:b w:val="0"/>
+                <w:i w:val="0"/>
+                <w:color w:val="000000"/>
+                <w:sz w:val="18"/>
+              </w:rPr>
+              <w:t>• Electron shell diagrams showing stable noble gases - Comparison of unstable atoms (e.g., Na, Cl) before bonding</w:t>
             </w:r>
           </w:p>
         </w:tc>
@@ -1247,6 +1397,22 @@
           <w:p>
             <w:pPr>
               <w:spacing w:before="20" w:after="20"/>
+              <w:jc w:val="left"/>
+            </w:pPr>
+            <w:r>
+              <w:rPr>
+                <w:rFonts w:ascii="Arial" w:hAnsi="Arial"/>
+                <w:b/>
+                <w:i w:val="0"/>
+                <w:color w:val="000000"/>
+                <w:sz w:val="18"/>
+              </w:rPr>
+              <w:t>Guiding Questions:</w:t>
+            </w:r>
+          </w:p>
+          <w:p>
+            <w:pPr>
+              <w:spacing w:before="20" w:after="20"/>
               <w:ind w:left="240"/>
               <w:jc w:val="left"/>
             </w:pPr>
@@ -1258,7 +1424,7 @@
                 <w:color w:val="000000"/>
                 <w:sz w:val="18"/>
               </w:rPr>
-              <w:t>• How do ionic bonds form through electron transfer?</w:t>
+              <w:t>• How do ionic bonds form? (electron transfer)</w:t>
             </w:r>
           </w:p>
           <w:p>
@@ -1309,7 +1475,7 @@
                 <w:color w:val="000000"/>
                 <w:sz w:val="18"/>
               </w:rPr>
-              <w:t>• What properties do ionic compounds have (melting point, conductivity, solubility, brittleness)?</w:t>
+              <w:t>• What is the structure of an ionic compound like sodium chloride (NaCl)?</w:t>
             </w:r>
           </w:p>
           <w:p>
@@ -1326,7 +1492,209 @@
                 <w:color w:val="000000"/>
                 <w:sz w:val="18"/>
               </w:rPr>
+              <w:t>• What properties do ionic compounds have? (melting point, conductivity, solubility, brittleness)</w:t>
+            </w:r>
+          </w:p>
+          <w:p>
+            <w:pPr>
+              <w:spacing w:before="20" w:after="20"/>
+              <w:ind w:left="240"/>
+              <w:jc w:val="left"/>
+            </w:pPr>
+            <w:r>
+              <w:rPr>
+                <w:rFonts w:ascii="Arial" w:hAnsi="Arial"/>
+                <w:b w:val="0"/>
+                <w:i w:val="0"/>
+                <w:color w:val="000000"/>
+                <w:sz w:val="18"/>
+              </w:rPr>
               <w:t>• Why do ionic compounds have these properties?</w:t>
+            </w:r>
+          </w:p>
+          <w:p>
+            <w:pPr>
+              <w:spacing w:before="20" w:after="20"/>
+              <w:jc w:val="left"/>
+            </w:pPr>
+            <w:r>
+              <w:rPr>
+                <w:rFonts w:ascii="Arial" w:hAnsi="Arial"/>
+                <w:b/>
+                <w:i w:val="0"/>
+                <w:color w:val="000000"/>
+                <w:sz w:val="18"/>
+              </w:rPr>
+              <w:t>What to Include:</w:t>
+            </w:r>
+          </w:p>
+          <w:p>
+            <w:pPr>
+              <w:spacing w:before="20" w:after="20"/>
+              <w:ind w:left="240"/>
+              <w:jc w:val="left"/>
+            </w:pPr>
+            <w:r>
+              <w:rPr>
+                <w:rFonts w:ascii="Arial" w:hAnsi="Arial"/>
+                <w:b w:val="0"/>
+                <w:i w:val="0"/>
+                <w:color w:val="000000"/>
+                <w:sz w:val="18"/>
+              </w:rPr>
+              <w:t>• Step-by-step explanation of electron transfer between metal and non-metal atoms</w:t>
+            </w:r>
+          </w:p>
+          <w:p>
+            <w:pPr>
+              <w:spacing w:before="20" w:after="20"/>
+              <w:ind w:left="240"/>
+              <w:jc w:val="left"/>
+            </w:pPr>
+            <w:r>
+              <w:rPr>
+                <w:rFonts w:ascii="Arial" w:hAnsi="Arial"/>
+                <w:b w:val="0"/>
+                <w:i w:val="0"/>
+                <w:color w:val="000000"/>
+                <w:sz w:val="18"/>
+              </w:rPr>
+              <w:t>• Formation of cations and anions</w:t>
+            </w:r>
+          </w:p>
+          <w:p>
+            <w:pPr>
+              <w:spacing w:before="20" w:after="20"/>
+              <w:ind w:left="240"/>
+              <w:jc w:val="left"/>
+            </w:pPr>
+            <w:r>
+              <w:rPr>
+                <w:rFonts w:ascii="Arial" w:hAnsi="Arial"/>
+                <w:b w:val="0"/>
+                <w:i w:val="0"/>
+                <w:color w:val="000000"/>
+                <w:sz w:val="18"/>
+              </w:rPr>
+              <w:t>• Lewis dot diagrams showing ionic bond formation (e.g., Na + Cl → Na⁺Cl⁻)</w:t>
+            </w:r>
+          </w:p>
+          <w:p>
+            <w:pPr>
+              <w:spacing w:before="20" w:after="20"/>
+              <w:ind w:left="240"/>
+              <w:jc w:val="left"/>
+            </w:pPr>
+            <w:r>
+              <w:rPr>
+                <w:rFonts w:ascii="Arial" w:hAnsi="Arial"/>
+                <w:b w:val="0"/>
+                <w:i w:val="0"/>
+                <w:color w:val="000000"/>
+                <w:sz w:val="18"/>
+              </w:rPr>
+              <w:t>• Description of the giant ionic lattice structure</w:t>
+            </w:r>
+          </w:p>
+          <w:p>
+            <w:pPr>
+              <w:spacing w:before="20" w:after="20"/>
+              <w:ind w:left="240"/>
+              <w:jc w:val="left"/>
+            </w:pPr>
+            <w:r>
+              <w:rPr>
+                <w:rFonts w:ascii="Arial" w:hAnsi="Arial"/>
+                <w:b w:val="0"/>
+                <w:i w:val="0"/>
+                <w:color w:val="000000"/>
+                <w:sz w:val="18"/>
+              </w:rPr>
+              <w:t>• Physical properties: high melting/boiling points, conduct electricity when molten or dissolved (not solid), soluble in water, brittle</w:t>
+            </w:r>
+          </w:p>
+          <w:p>
+            <w:pPr>
+              <w:spacing w:before="20" w:after="20"/>
+              <w:ind w:left="240"/>
+              <w:jc w:val="left"/>
+            </w:pPr>
+            <w:r>
+              <w:rPr>
+                <w:rFonts w:ascii="Arial" w:hAnsi="Arial"/>
+                <w:b w:val="0"/>
+                <w:i w:val="0"/>
+                <w:color w:val="000000"/>
+                <w:sz w:val="18"/>
+              </w:rPr>
+              <w:t>• Explanation linking structure to properties (strong electrostatic forces, regular lattice, mobile ions when dissolved)</w:t>
+            </w:r>
+          </w:p>
+          <w:p>
+            <w:pPr>
+              <w:spacing w:before="20" w:after="20"/>
+              <w:jc w:val="left"/>
+            </w:pPr>
+            <w:r>
+              <w:rPr>
+                <w:rFonts w:ascii="Arial" w:hAnsi="Arial"/>
+                <w:b/>
+                <w:i w:val="0"/>
+                <w:color w:val="000000"/>
+                <w:sz w:val="18"/>
+              </w:rPr>
+              <w:t>Suggested Diagrams:</w:t>
+            </w:r>
+          </w:p>
+          <w:p>
+            <w:pPr>
+              <w:spacing w:before="20" w:after="20"/>
+              <w:ind w:left="240"/>
+              <w:jc w:val="left"/>
+            </w:pPr>
+            <w:r>
+              <w:rPr>
+                <w:rFonts w:ascii="Arial" w:hAnsi="Arial"/>
+                <w:b w:val="0"/>
+                <w:i w:val="0"/>
+                <w:color w:val="000000"/>
+                <w:sz w:val="18"/>
+              </w:rPr>
+              <w:t>• Lewis diagrams for ionic bond formation</w:t>
+            </w:r>
+          </w:p>
+          <w:p>
+            <w:pPr>
+              <w:spacing w:before="20" w:after="20"/>
+              <w:ind w:left="240"/>
+              <w:jc w:val="left"/>
+            </w:pPr>
+            <w:r>
+              <w:rPr>
+                <w:rFonts w:ascii="Arial" w:hAnsi="Arial"/>
+                <w:b w:val="0"/>
+                <w:i w:val="0"/>
+                <w:color w:val="000000"/>
+                <w:sz w:val="18"/>
+              </w:rPr>
+              <w:t>• 3D representation of NaCl lattice structure</w:t>
+            </w:r>
+          </w:p>
+          <w:p>
+            <w:pPr>
+              <w:spacing w:before="20" w:after="20"/>
+              <w:ind w:left="240"/>
+              <w:jc w:val="left"/>
+            </w:pPr>
+            <w:r>
+              <w:rPr>
+                <w:rFonts w:ascii="Arial" w:hAnsi="Arial"/>
+                <w:b w:val="0"/>
+                <w:i w:val="0"/>
+                <w:color w:val="000000"/>
+                <w:sz w:val="18"/>
+              </w:rPr>
+              <w:t>• Diagram showing ion movement in solution (conductivity)</w:t>
             </w:r>
           </w:p>
         </w:tc>
@@ -1528,6 +1896,22 @@
           <w:p>
             <w:pPr>
               <w:spacing w:before="20" w:after="20"/>
+              <w:jc w:val="left"/>
+            </w:pPr>
+            <w:r>
+              <w:rPr>
+                <w:rFonts w:ascii="Arial" w:hAnsi="Arial"/>
+                <w:b/>
+                <w:i w:val="0"/>
+                <w:color w:val="000000"/>
+                <w:sz w:val="18"/>
+              </w:rPr>
+              <w:t>Guiding Questions:</w:t>
+            </w:r>
+          </w:p>
+          <w:p>
+            <w:pPr>
+              <w:spacing w:before="20" w:after="20"/>
               <w:ind w:left="240"/>
               <w:jc w:val="left"/>
             </w:pPr>
@@ -1539,7 +1923,7 @@
                 <w:color w:val="000000"/>
                 <w:sz w:val="18"/>
               </w:rPr>
-              <w:t>• How do covalent bonds form through electron sharing?</w:t>
+              <w:t>• How do covalent bonds form? (electron sharing)</w:t>
             </w:r>
           </w:p>
           <w:p>
@@ -1556,6 +1940,23 @@
                 <w:color w:val="000000"/>
                 <w:sz w:val="18"/>
               </w:rPr>
+              <w:t>• What types of atoms form covalent bonds?</w:t>
+            </w:r>
+          </w:p>
+          <w:p>
+            <w:pPr>
+              <w:spacing w:before="20" w:after="20"/>
+              <w:ind w:left="240"/>
+              <w:jc w:val="left"/>
+            </w:pPr>
+            <w:r>
+              <w:rPr>
+                <w:rFonts w:ascii="Arial" w:hAnsi="Arial"/>
+                <w:b w:val="0"/>
+                <w:i w:val="0"/>
+                <w:color w:val="000000"/>
+                <w:sz w:val="18"/>
+              </w:rPr>
               <w:t>• What is the difference between simple molecular and giant covalent structures?</w:t>
             </w:r>
           </w:p>
@@ -1590,23 +1991,294 @@
                 <w:color w:val="000000"/>
                 <w:sz w:val="18"/>
               </w:rPr>
-              <w:t>• What properties do simple molecular substances have vs. giant covalent structures?</w:t>
-            </w:r>
-          </w:p>
-          <w:p>
-            <w:pPr>
-              <w:spacing w:before="20" w:after="20"/>
-              <w:jc w:val="left"/>
-            </w:pPr>
-            <w:r>
-              <w:rPr>
-                <w:rFonts w:ascii="Arial" w:hAnsi="Arial"/>
-                <w:b w:val="0"/>
-                <w:i w:val="0"/>
-                <w:color w:val="000000"/>
-                <w:sz w:val="18"/>
-              </w:rPr>
-              <w:t>Draw Lewis diagrams for simple molecules (H₂, H₂O, CO₂, CH₄).</w:t>
+              <w:t>• What properties do simple molecular substances have?</w:t>
+            </w:r>
+          </w:p>
+          <w:p>
+            <w:pPr>
+              <w:spacing w:before="20" w:after="20"/>
+              <w:ind w:left="240"/>
+              <w:jc w:val="left"/>
+            </w:pPr>
+            <w:r>
+              <w:rPr>
+                <w:rFonts w:ascii="Arial" w:hAnsi="Arial"/>
+                <w:b w:val="0"/>
+                <w:i w:val="0"/>
+                <w:color w:val="000000"/>
+                <w:sz w:val="18"/>
+              </w:rPr>
+              <w:t>• What properties do giant covalent substances have?</w:t>
+            </w:r>
+          </w:p>
+          <w:p>
+            <w:pPr>
+              <w:spacing w:before="20" w:after="20"/>
+              <w:ind w:left="240"/>
+              <w:jc w:val="left"/>
+            </w:pPr>
+            <w:r>
+              <w:rPr>
+                <w:rFonts w:ascii="Arial" w:hAnsi="Arial"/>
+                <w:b w:val="0"/>
+                <w:i w:val="0"/>
+                <w:color w:val="000000"/>
+                <w:sz w:val="18"/>
+              </w:rPr>
+              <w:t>• How can we represent covalent bonding using Lewis diagrams?</w:t>
+            </w:r>
+          </w:p>
+          <w:p>
+            <w:pPr>
+              <w:spacing w:before="20" w:after="20"/>
+              <w:jc w:val="left"/>
+            </w:pPr>
+            <w:r>
+              <w:rPr>
+                <w:rFonts w:ascii="Arial" w:hAnsi="Arial"/>
+                <w:b/>
+                <w:i w:val="0"/>
+                <w:color w:val="000000"/>
+                <w:sz w:val="18"/>
+              </w:rPr>
+              <w:t>What to Include:</w:t>
+            </w:r>
+          </w:p>
+          <w:p>
+            <w:pPr>
+              <w:spacing w:before="20" w:after="20"/>
+              <w:ind w:left="240"/>
+              <w:jc w:val="left"/>
+            </w:pPr>
+            <w:r>
+              <w:rPr>
+                <w:rFonts w:ascii="Arial" w:hAnsi="Arial"/>
+                <w:b w:val="0"/>
+                <w:i w:val="0"/>
+                <w:color w:val="000000"/>
+                <w:sz w:val="18"/>
+              </w:rPr>
+              <w:t>• Explanation of electron sharing between non-metal atoms</w:t>
+            </w:r>
+          </w:p>
+          <w:p>
+            <w:pPr>
+              <w:spacing w:before="20" w:after="20"/>
+              <w:ind w:left="240"/>
+              <w:jc w:val="left"/>
+            </w:pPr>
+            <w:r>
+              <w:rPr>
+                <w:rFonts w:ascii="Arial" w:hAnsi="Arial"/>
+                <w:b w:val="0"/>
+                <w:i w:val="0"/>
+                <w:color w:val="000000"/>
+                <w:sz w:val="18"/>
+              </w:rPr>
+              <w:t>• Lewis diagrams for simple molecules (H₂, H₂O, CO₂, CH₄)</w:t>
+            </w:r>
+          </w:p>
+          <w:p>
+            <w:pPr>
+              <w:spacing w:before="20" w:after="20"/>
+              <w:ind w:left="240"/>
+              <w:jc w:val="left"/>
+            </w:pPr>
+            <w:r>
+              <w:rPr>
+                <w:rFonts w:ascii="Arial" w:hAnsi="Arial"/>
+                <w:b w:val="0"/>
+                <w:i w:val="0"/>
+                <w:color w:val="000000"/>
+                <w:sz w:val="18"/>
+              </w:rPr>
+              <w:t>• Simple molecular structures: small molecules held together by weak intermolecular forces</w:t>
+            </w:r>
+          </w:p>
+          <w:p>
+            <w:pPr>
+              <w:spacing w:before="20" w:after="20"/>
+              <w:ind w:left="240"/>
+              <w:jc w:val="left"/>
+            </w:pPr>
+            <w:r>
+              <w:rPr>
+                <w:rFonts w:ascii="Arial" w:hAnsi="Arial"/>
+                <w:b w:val="0"/>
+                <w:i w:val="0"/>
+                <w:color w:val="000000"/>
+                <w:sz w:val="18"/>
+              </w:rPr>
+              <w:t>• Properties: low melting/boiling points, do not conduct electricity, often gases or liquids at room temperature</w:t>
+            </w:r>
+          </w:p>
+          <w:p>
+            <w:pPr>
+              <w:spacing w:before="20" w:after="20"/>
+              <w:ind w:left="240"/>
+              <w:jc w:val="left"/>
+            </w:pPr>
+            <w:r>
+              <w:rPr>
+                <w:rFonts w:ascii="Arial" w:hAnsi="Arial"/>
+                <w:b w:val="0"/>
+                <w:i w:val="0"/>
+                <w:color w:val="000000"/>
+                <w:sz w:val="18"/>
+              </w:rPr>
+              <w:t>• Examples: water, carbon dioxide, methane</w:t>
+            </w:r>
+          </w:p>
+          <w:p>
+            <w:pPr>
+              <w:spacing w:before="20" w:after="20"/>
+              <w:ind w:left="240"/>
+              <w:jc w:val="left"/>
+            </w:pPr>
+            <w:r>
+              <w:rPr>
+                <w:rFonts w:ascii="Arial" w:hAnsi="Arial"/>
+                <w:b w:val="0"/>
+                <w:i w:val="0"/>
+                <w:color w:val="000000"/>
+                <w:sz w:val="18"/>
+              </w:rPr>
+              <w:t>• Giant covalent structures: extensive networks of covalently bonded atoms</w:t>
+            </w:r>
+          </w:p>
+          <w:p>
+            <w:pPr>
+              <w:spacing w:before="20" w:after="20"/>
+              <w:ind w:left="240"/>
+              <w:jc w:val="left"/>
+            </w:pPr>
+            <w:r>
+              <w:rPr>
+                <w:rFonts w:ascii="Arial" w:hAnsi="Arial"/>
+                <w:b w:val="0"/>
+                <w:i w:val="0"/>
+                <w:color w:val="000000"/>
+                <w:sz w:val="18"/>
+              </w:rPr>
+              <w:t>• Properties: very high melting points, very hard (usually), do not conduct electricity (except graphite)</w:t>
+            </w:r>
+          </w:p>
+          <w:p>
+            <w:pPr>
+              <w:spacing w:before="20" w:after="20"/>
+              <w:ind w:left="240"/>
+              <w:jc w:val="left"/>
+            </w:pPr>
+            <w:r>
+              <w:rPr>
+                <w:rFonts w:ascii="Arial" w:hAnsi="Arial"/>
+                <w:b w:val="0"/>
+                <w:i w:val="0"/>
+                <w:color w:val="000000"/>
+                <w:sz w:val="18"/>
+              </w:rPr>
+              <w:t>• Examples: diamond, graphite, silicon dioxide (sand/quartz)</w:t>
+            </w:r>
+          </w:p>
+          <w:p>
+            <w:pPr>
+              <w:spacing w:before="20" w:after="20"/>
+              <w:ind w:left="240"/>
+              <w:jc w:val="left"/>
+            </w:pPr>
+            <w:r>
+              <w:rPr>
+                <w:rFonts w:ascii="Arial" w:hAnsi="Arial"/>
+                <w:b w:val="0"/>
+                <w:i w:val="0"/>
+                <w:color w:val="000000"/>
+                <w:sz w:val="18"/>
+              </w:rPr>
+              <w:t>• Detailed comparison of diamond and graphite (see example below)</w:t>
+            </w:r>
+          </w:p>
+          <w:p>
+            <w:pPr>
+              <w:spacing w:before="20" w:after="20"/>
+              <w:jc w:val="left"/>
+            </w:pPr>
+            <w:r>
+              <w:rPr>
+                <w:rFonts w:ascii="Arial" w:hAnsi="Arial"/>
+                <w:b/>
+                <w:i w:val="0"/>
+                <w:color w:val="000000"/>
+                <w:sz w:val="18"/>
+              </w:rPr>
+              <w:t>Suggested Diagrams:</w:t>
+            </w:r>
+          </w:p>
+          <w:p>
+            <w:pPr>
+              <w:spacing w:before="20" w:after="20"/>
+              <w:ind w:left="240"/>
+              <w:jc w:val="left"/>
+            </w:pPr>
+            <w:r>
+              <w:rPr>
+                <w:rFonts w:ascii="Arial" w:hAnsi="Arial"/>
+                <w:b w:val="0"/>
+                <w:i w:val="0"/>
+                <w:color w:val="000000"/>
+                <w:sz w:val="18"/>
+              </w:rPr>
+              <w:t>• Lewis structures for simple molecules</w:t>
+            </w:r>
+          </w:p>
+          <w:p>
+            <w:pPr>
+              <w:spacing w:before="20" w:after="20"/>
+              <w:ind w:left="240"/>
+              <w:jc w:val="left"/>
+            </w:pPr>
+            <w:r>
+              <w:rPr>
+                <w:rFonts w:ascii="Arial" w:hAnsi="Arial"/>
+                <w:b w:val="0"/>
+                <w:i w:val="0"/>
+                <w:color w:val="000000"/>
+                <w:sz w:val="18"/>
+              </w:rPr>
+              <w:t>• 3D structure of diamond (tetrahedral network)</w:t>
+            </w:r>
+          </w:p>
+          <w:p>
+            <w:pPr>
+              <w:spacing w:before="20" w:after="20"/>
+              <w:ind w:left="240"/>
+              <w:jc w:val="left"/>
+            </w:pPr>
+            <w:r>
+              <w:rPr>
+                <w:rFonts w:ascii="Arial" w:hAnsi="Arial"/>
+                <w:b w:val="0"/>
+                <w:i w:val="0"/>
+                <w:color w:val="000000"/>
+                <w:sz w:val="18"/>
+              </w:rPr>
+              <w:t>• Layered structure of graphite</w:t>
+            </w:r>
+          </w:p>
+          <w:p>
+            <w:pPr>
+              <w:spacing w:before="20" w:after="20"/>
+              <w:ind w:left="240"/>
+              <w:jc w:val="left"/>
+            </w:pPr>
+            <w:r>
+              <w:rPr>
+                <w:rFonts w:ascii="Arial" w:hAnsi="Arial"/>
+                <w:b w:val="0"/>
+                <w:i w:val="0"/>
+                <w:color w:val="000000"/>
+                <w:sz w:val="18"/>
+              </w:rPr>
+              <w:t>• Structure of silicon dioxide</w:t>
             </w:r>
           </w:p>
         </w:tc>
@@ -1806,6 +2478,22 @@
           <w:p>
             <w:pPr>
               <w:spacing w:before="20" w:after="20"/>
+              <w:jc w:val="left"/>
+            </w:pPr>
+            <w:r>
+              <w:rPr>
+                <w:rFonts w:ascii="Arial" w:hAnsi="Arial"/>
+                <w:b/>
+                <w:i w:val="0"/>
+                <w:color w:val="000000"/>
+                <w:sz w:val="18"/>
+              </w:rPr>
+              <w:t>Guiding Questions:</w:t>
+            </w:r>
+          </w:p>
+          <w:p>
+            <w:pPr>
+              <w:spacing w:before="20" w:after="20"/>
               <w:ind w:left="240"/>
               <w:jc w:val="left"/>
             </w:pPr>
@@ -1817,7 +2505,7 @@
                 <w:color w:val="000000"/>
                 <w:sz w:val="18"/>
               </w:rPr>
-              <w:t>• What is a dative covalent bond and how does it differ from a regular covalent bond?</w:t>
+              <w:t>• What is a dative (coordinate) covalent bond and how does it differ from a regular covalent bond?</w:t>
             </w:r>
           </w:p>
           <w:p>
@@ -1834,7 +2522,7 @@
                 <w:color w:val="000000"/>
                 <w:sz w:val="18"/>
               </w:rPr>
-              <w:t>• How do metallic bonds form and what properties do they give?</w:t>
+              <w:t>• How do metallic bonds form and what structure do they create?</w:t>
             </w:r>
           </w:p>
           <w:p>
@@ -1868,7 +2556,443 @@
                 <w:color w:val="000000"/>
                 <w:sz w:val="18"/>
               </w:rPr>
-              <w:t>• What are Van der Waals forces and how do they affect properties?</w:t>
+              <w:t>• What are Van der Waals forces?</w:t>
+            </w:r>
+          </w:p>
+          <w:p>
+            <w:pPr>
+              <w:spacing w:before="20" w:after="20"/>
+              <w:ind w:left="240"/>
+              <w:jc w:val="left"/>
+            </w:pPr>
+            <w:r>
+              <w:rPr>
+                <w:rFonts w:ascii="Arial" w:hAnsi="Arial"/>
+                <w:b w:val="0"/>
+                <w:i w:val="0"/>
+                <w:color w:val="000000"/>
+                <w:sz w:val="18"/>
+              </w:rPr>
+              <w:t>• How do these bond types affect properties?</w:t>
+            </w:r>
+          </w:p>
+          <w:p>
+            <w:pPr>
+              <w:spacing w:before="20" w:after="20"/>
+              <w:jc w:val="left"/>
+            </w:pPr>
+            <w:r>
+              <w:rPr>
+                <w:rFonts w:ascii="Arial" w:hAnsi="Arial"/>
+                <w:b/>
+                <w:i w:val="0"/>
+                <w:color w:val="000000"/>
+                <w:sz w:val="18"/>
+              </w:rPr>
+              <w:t>What to Include:</w:t>
+            </w:r>
+          </w:p>
+          <w:p>
+            <w:pPr>
+              <w:spacing w:before="20" w:after="20"/>
+              <w:jc w:val="left"/>
+            </w:pPr>
+            <w:r>
+              <w:rPr>
+                <w:rFonts w:ascii="Arial" w:hAnsi="Arial"/>
+                <w:b/>
+                <w:i w:val="0"/>
+                <w:color w:val="000000"/>
+                <w:sz w:val="18"/>
+              </w:rPr>
+              <w:t>Dative Covalent Bonds:</w:t>
+            </w:r>
+          </w:p>
+          <w:p>
+            <w:pPr>
+              <w:spacing w:before="20" w:after="20"/>
+              <w:ind w:left="240"/>
+              <w:jc w:val="left"/>
+            </w:pPr>
+            <w:r>
+              <w:rPr>
+                <w:rFonts w:ascii="Arial" w:hAnsi="Arial"/>
+                <w:b w:val="0"/>
+                <w:i w:val="0"/>
+                <w:color w:val="000000"/>
+                <w:sz w:val="18"/>
+              </w:rPr>
+              <w:t>• Definition: both electrons in the shared pair come from one atom</w:t>
+            </w:r>
+          </w:p>
+          <w:p>
+            <w:pPr>
+              <w:spacing w:before="20" w:after="20"/>
+              <w:ind w:left="240"/>
+              <w:jc w:val="left"/>
+            </w:pPr>
+            <w:r>
+              <w:rPr>
+                <w:rFonts w:ascii="Arial" w:hAnsi="Arial"/>
+                <w:b w:val="0"/>
+                <w:i w:val="0"/>
+                <w:color w:val="000000"/>
+                <w:sz w:val="18"/>
+              </w:rPr>
+              <w:t>• Example: ammonium ion (NH₄⁺), formation from NH₃ and H⁺</w:t>
+            </w:r>
+          </w:p>
+          <w:p>
+            <w:pPr>
+              <w:spacing w:before="20" w:after="20"/>
+              <w:ind w:left="240"/>
+              <w:jc w:val="left"/>
+            </w:pPr>
+            <w:r>
+              <w:rPr>
+                <w:rFonts w:ascii="Arial" w:hAnsi="Arial"/>
+                <w:b w:val="0"/>
+                <w:i w:val="0"/>
+                <w:color w:val="000000"/>
+                <w:sz w:val="18"/>
+              </w:rPr>
+              <w:t>• Once formed, identical to regular covalent bonds</w:t>
+            </w:r>
+          </w:p>
+          <w:p>
+            <w:pPr>
+              <w:spacing w:before="20" w:after="20"/>
+              <w:jc w:val="left"/>
+            </w:pPr>
+            <w:r>
+              <w:rPr>
+                <w:rFonts w:ascii="Arial" w:hAnsi="Arial"/>
+                <w:b/>
+                <w:i w:val="0"/>
+                <w:color w:val="000000"/>
+                <w:sz w:val="18"/>
+              </w:rPr>
+              <w:t>Metallic Bonds:</w:t>
+            </w:r>
+          </w:p>
+          <w:p>
+            <w:pPr>
+              <w:spacing w:before="20" w:after="20"/>
+              <w:ind w:left="240"/>
+              <w:jc w:val="left"/>
+            </w:pPr>
+            <w:r>
+              <w:rPr>
+                <w:rFonts w:ascii="Arial" w:hAnsi="Arial"/>
+                <w:b w:val="0"/>
+                <w:i w:val="0"/>
+                <w:color w:val="000000"/>
+                <w:sz w:val="18"/>
+              </w:rPr>
+              <w:t>• Structure: lattice of positive metal ions surrounded by a “sea” of delocalized electrons</w:t>
+            </w:r>
+          </w:p>
+          <w:p>
+            <w:pPr>
+              <w:spacing w:before="20" w:after="20"/>
+              <w:ind w:left="240"/>
+              <w:jc w:val="left"/>
+            </w:pPr>
+            <w:r>
+              <w:rPr>
+                <w:rFonts w:ascii="Arial" w:hAnsi="Arial"/>
+                <w:b w:val="0"/>
+                <w:i w:val="0"/>
+                <w:color w:val="000000"/>
+                <w:sz w:val="18"/>
+              </w:rPr>
+              <w:t>• Properties: electrical conductivity, thermal conductivity, malleability, ductility, luster</w:t>
+            </w:r>
+          </w:p>
+          <w:p>
+            <w:pPr>
+              <w:spacing w:before="20" w:after="20"/>
+              <w:ind w:left="240"/>
+              <w:jc w:val="left"/>
+            </w:pPr>
+            <w:r>
+              <w:rPr>
+                <w:rFonts w:ascii="Arial" w:hAnsi="Arial"/>
+                <w:b w:val="0"/>
+                <w:i w:val="0"/>
+                <w:color w:val="000000"/>
+                <w:sz w:val="18"/>
+              </w:rPr>
+              <w:t>• Explanation: mobile electrons allow conductivity; layers can slide (malleability)</w:t>
+            </w:r>
+          </w:p>
+          <w:p>
+            <w:pPr>
+              <w:spacing w:before="20" w:after="20"/>
+              <w:ind w:left="240"/>
+              <w:jc w:val="left"/>
+            </w:pPr>
+            <w:r>
+              <w:rPr>
+                <w:rFonts w:ascii="Arial" w:hAnsi="Arial"/>
+                <w:b w:val="0"/>
+                <w:i w:val="0"/>
+                <w:color w:val="000000"/>
+                <w:sz w:val="18"/>
+              </w:rPr>
+              <w:t>• Examples: copper, iron, aluminum, gold</w:t>
+            </w:r>
+          </w:p>
+          <w:p>
+            <w:pPr>
+              <w:spacing w:before="20" w:after="20"/>
+              <w:jc w:val="left"/>
+            </w:pPr>
+            <w:r>
+              <w:rPr>
+                <w:rFonts w:ascii="Arial" w:hAnsi="Arial"/>
+                <w:b/>
+                <w:i w:val="0"/>
+                <w:color w:val="000000"/>
+                <w:sz w:val="18"/>
+              </w:rPr>
+              <w:t>Hydrogen Bonds:</w:t>
+            </w:r>
+          </w:p>
+          <w:p>
+            <w:pPr>
+              <w:spacing w:before="20" w:after="20"/>
+              <w:ind w:left="240"/>
+              <w:jc w:val="left"/>
+            </w:pPr>
+            <w:r>
+              <w:rPr>
+                <w:rFonts w:ascii="Arial" w:hAnsi="Arial"/>
+                <w:b w:val="0"/>
+                <w:i w:val="0"/>
+                <w:color w:val="000000"/>
+                <w:sz w:val="18"/>
+              </w:rPr>
+              <w:t>• Definition: strong intermolecular force between H bonded to N, O, or F and another electronegative atom</w:t>
+            </w:r>
+          </w:p>
+          <w:p>
+            <w:pPr>
+              <w:spacing w:before="20" w:after="20"/>
+              <w:ind w:left="240"/>
+              <w:jc w:val="left"/>
+            </w:pPr>
+            <w:r>
+              <w:rPr>
+                <w:rFonts w:ascii="Arial" w:hAnsi="Arial"/>
+                <w:b w:val="0"/>
+                <w:i w:val="0"/>
+                <w:color w:val="000000"/>
+                <w:sz w:val="18"/>
+              </w:rPr>
+              <w:t>• Not a true bond, but stronger than Van der Waals forces</w:t>
+            </w:r>
+          </w:p>
+          <w:p>
+            <w:pPr>
+              <w:spacing w:before="20" w:after="20"/>
+              <w:ind w:left="240"/>
+              <w:jc w:val="left"/>
+            </w:pPr>
+            <w:r>
+              <w:rPr>
+                <w:rFonts w:ascii="Arial" w:hAnsi="Arial"/>
+                <w:b w:val="0"/>
+                <w:i w:val="0"/>
+                <w:color w:val="000000"/>
+                <w:sz w:val="18"/>
+              </w:rPr>
+              <w:t>• Example: water molecules, explaining water’s high boiling point and surface tension</w:t>
+            </w:r>
+          </w:p>
+          <w:p>
+            <w:pPr>
+              <w:spacing w:before="20" w:after="20"/>
+              <w:ind w:left="240"/>
+              <w:jc w:val="left"/>
+            </w:pPr>
+            <w:r>
+              <w:rPr>
+                <w:rFonts w:ascii="Arial" w:hAnsi="Arial"/>
+                <w:b w:val="0"/>
+                <w:i w:val="0"/>
+                <w:color w:val="000000"/>
+                <w:sz w:val="18"/>
+              </w:rPr>
+              <w:t>• Importance in biological molecules (DNA, proteins)</w:t>
+            </w:r>
+          </w:p>
+          <w:p>
+            <w:pPr>
+              <w:spacing w:before="20" w:after="20"/>
+              <w:jc w:val="left"/>
+            </w:pPr>
+            <w:r>
+              <w:rPr>
+                <w:rFonts w:ascii="Arial" w:hAnsi="Arial"/>
+                <w:b/>
+                <w:i w:val="0"/>
+                <w:color w:val="000000"/>
+                <w:sz w:val="18"/>
+              </w:rPr>
+              <w:t>Van der Waals Forces:</w:t>
+            </w:r>
+          </w:p>
+          <w:p>
+            <w:pPr>
+              <w:spacing w:before="20" w:after="20"/>
+              <w:ind w:left="240"/>
+              <w:jc w:val="left"/>
+            </w:pPr>
+            <w:r>
+              <w:rPr>
+                <w:rFonts w:ascii="Arial" w:hAnsi="Arial"/>
+                <w:b w:val="0"/>
+                <w:i w:val="0"/>
+                <w:color w:val="000000"/>
+                <w:sz w:val="18"/>
+              </w:rPr>
+              <w:t>• Weak intermolecular forces between molecules</w:t>
+            </w:r>
+          </w:p>
+          <w:p>
+            <w:pPr>
+              <w:spacing w:before="20" w:after="20"/>
+              <w:ind w:left="240"/>
+              <w:jc w:val="left"/>
+            </w:pPr>
+            <w:r>
+              <w:rPr>
+                <w:rFonts w:ascii="Arial" w:hAnsi="Arial"/>
+                <w:b w:val="0"/>
+                <w:i w:val="0"/>
+                <w:color w:val="000000"/>
+                <w:sz w:val="18"/>
+              </w:rPr>
+              <w:t>• Types: London dispersion forces (all molecules), dipole-dipole forces (polar molecules)</w:t>
+            </w:r>
+          </w:p>
+          <w:p>
+            <w:pPr>
+              <w:spacing w:before="20" w:after="20"/>
+              <w:ind w:left="240"/>
+              <w:jc w:val="left"/>
+            </w:pPr>
+            <w:r>
+              <w:rPr>
+                <w:rFonts w:ascii="Arial" w:hAnsi="Arial"/>
+                <w:b w:val="0"/>
+                <w:i w:val="0"/>
+                <w:color w:val="000000"/>
+                <w:sz w:val="18"/>
+              </w:rPr>
+              <w:t>• Affect boiling/melting points of molecular substances</w:t>
+            </w:r>
+          </w:p>
+          <w:p>
+            <w:pPr>
+              <w:spacing w:before="20" w:after="20"/>
+              <w:ind w:left="240"/>
+              <w:jc w:val="left"/>
+            </w:pPr>
+            <w:r>
+              <w:rPr>
+                <w:rFonts w:ascii="Arial" w:hAnsi="Arial"/>
+                <w:b w:val="0"/>
+                <w:i w:val="0"/>
+                <w:color w:val="000000"/>
+                <w:sz w:val="18"/>
+              </w:rPr>
+              <w:t>• Stronger in larger molecules</w:t>
+            </w:r>
+          </w:p>
+          <w:p>
+            <w:pPr>
+              <w:spacing w:before="20" w:after="20"/>
+              <w:jc w:val="left"/>
+            </w:pPr>
+            <w:r>
+              <w:rPr>
+                <w:rFonts w:ascii="Arial" w:hAnsi="Arial"/>
+                <w:b/>
+                <w:i w:val="0"/>
+                <w:color w:val="000000"/>
+                <w:sz w:val="18"/>
+              </w:rPr>
+              <w:t>Suggested Diagrams:</w:t>
+            </w:r>
+          </w:p>
+          <w:p>
+            <w:pPr>
+              <w:spacing w:before="20" w:after="20"/>
+              <w:ind w:left="240"/>
+              <w:jc w:val="left"/>
+            </w:pPr>
+            <w:r>
+              <w:rPr>
+                <w:rFonts w:ascii="Arial" w:hAnsi="Arial"/>
+                <w:b w:val="0"/>
+                <w:i w:val="0"/>
+                <w:color w:val="000000"/>
+                <w:sz w:val="18"/>
+              </w:rPr>
+              <w:t>• Lewis structure showing dative bond in NH₄⁺</w:t>
+            </w:r>
+          </w:p>
+          <w:p>
+            <w:pPr>
+              <w:spacing w:before="20" w:after="20"/>
+              <w:ind w:left="240"/>
+              <w:jc w:val="left"/>
+            </w:pPr>
+            <w:r>
+              <w:rPr>
+                <w:rFonts w:ascii="Arial" w:hAnsi="Arial"/>
+                <w:b w:val="0"/>
+                <w:i w:val="0"/>
+                <w:color w:val="000000"/>
+                <w:sz w:val="18"/>
+              </w:rPr>
+              <w:t>• Metallic bonding model (sea of electrons)</w:t>
+            </w:r>
+          </w:p>
+          <w:p>
+            <w:pPr>
+              <w:spacing w:before="20" w:after="20"/>
+              <w:ind w:left="240"/>
+              <w:jc w:val="left"/>
+            </w:pPr>
+            <w:r>
+              <w:rPr>
+                <w:rFonts w:ascii="Arial" w:hAnsi="Arial"/>
+                <w:b w:val="0"/>
+                <w:i w:val="0"/>
+                <w:color w:val="000000"/>
+                <w:sz w:val="18"/>
+              </w:rPr>
+              <w:t>• Hydrogen bonding between water molecules</w:t>
+            </w:r>
+          </w:p>
+          <w:p>
+            <w:pPr>
+              <w:spacing w:before="20" w:after="20"/>
+              <w:ind w:left="240"/>
+              <w:jc w:val="left"/>
+            </w:pPr>
+            <w:r>
+              <w:rPr>
+                <w:rFonts w:ascii="Arial" w:hAnsi="Arial"/>
+                <w:b w:val="0"/>
+                <w:i w:val="0"/>
+                <w:color w:val="000000"/>
+                <w:sz w:val="18"/>
+              </w:rPr>
+              <w:t>• Representation of Van der Waals forces</w:t>
             </w:r>
           </w:p>
         </w:tc>
@@ -2052,7 +3176,7 @@
                 <w:color w:val="FFFFFF"/>
                 <w:sz w:val="22"/>
               </w:rPr>
-              <w:t>SECTION 5: HOW DOES BOND TYPE EXPLAIN PHYSICAL PROPERTIES AND REAL-LIFE USES?</w:t>
+              <w:t>SECTION 5: HOW DO BOND TYPES EXPLAIN THE PHYSICAL PROPERTIES OF SUBSTANCES?</w:t>
             </w:r>
           </w:p>
         </w:tc>
@@ -2071,60 +3195,264 @@
             <w:r>
               <w:rPr>
                 <w:rFonts w:ascii="Arial" w:hAnsi="Arial"/>
-                <w:b w:val="0"/>
-                <w:i w:val="0"/>
-                <w:color w:val="000000"/>
-                <w:sz w:val="18"/>
-              </w:rPr>
-              <w:t>Create a comparison table of ionic, simple molecular, giant covalent, and metallic substances (covering melting point, conductivity, hardness, solubility).</w:t>
-            </w:r>
-          </w:p>
-          <w:p>
-            <w:pPr>
-              <w:spacing w:before="20" w:after="20"/>
-              <w:jc w:val="left"/>
-            </w:pPr>
-            <w:r>
-              <w:rPr>
-                <w:rFonts w:ascii="Arial" w:hAnsi="Arial"/>
-                <w:b w:val="0"/>
-                <w:i w:val="0"/>
-                <w:color w:val="000000"/>
-                <w:sz w:val="18"/>
-              </w:rPr>
-              <w:t>Choose at least 4 substances and explain how their bonding and structure make them suitable for their uses (e.g. NaCl, diamond, graphite, copper, water).</w:t>
-            </w:r>
-          </w:p>
-          <w:p>
-            <w:pPr>
-              <w:spacing w:before="20" w:after="20"/>
-              <w:jc w:val="left"/>
-            </w:pPr>
-            <w:r>
-              <w:rPr>
-                <w:rFonts w:ascii="Arial" w:hAnsi="Arial"/>
                 <w:b/>
                 <w:i w:val="0"/>
                 <w:color w:val="000000"/>
                 <w:sz w:val="18"/>
               </w:rPr>
-              <w:t>Answer the driving question:</w:t>
-            </w:r>
-          </w:p>
-          <w:p>
-            <w:pPr>
-              <w:spacing w:before="20" w:after="20"/>
-              <w:jc w:val="left"/>
-            </w:pPr>
-            <w:r>
-              <w:rPr>
-                <w:rFonts w:ascii="Arial" w:hAnsi="Arial"/>
-                <w:b w:val="0"/>
-                <w:i w:val="0"/>
-                <w:color w:val="000000"/>
-                <w:sz w:val="18"/>
-              </w:rPr>
-              <w:t>How do the bonds between atoms determine the properties and uses of substances?</w:t>
+              <w:t>Guiding Questions:</w:t>
+            </w:r>
+          </w:p>
+          <w:p>
+            <w:pPr>
+              <w:spacing w:before="20" w:after="20"/>
+              <w:ind w:left="240"/>
+              <w:jc w:val="left"/>
+            </w:pPr>
+            <w:r>
+              <w:rPr>
+                <w:rFonts w:ascii="Arial" w:hAnsi="Arial"/>
+                <w:b w:val="0"/>
+                <w:i w:val="0"/>
+                <w:color w:val="000000"/>
+                <w:sz w:val="18"/>
+              </w:rPr>
+              <w:t>• How can we compare substances with different bonding types?</w:t>
+            </w:r>
+          </w:p>
+          <w:p>
+            <w:pPr>
+              <w:spacing w:before="20" w:after="20"/>
+              <w:ind w:left="240"/>
+              <w:jc w:val="left"/>
+            </w:pPr>
+            <w:r>
+              <w:rPr>
+                <w:rFonts w:ascii="Arial" w:hAnsi="Arial"/>
+                <w:b w:val="0"/>
+                <w:i w:val="0"/>
+                <w:color w:val="000000"/>
+                <w:sz w:val="18"/>
+              </w:rPr>
+              <w:t>• What patterns exist between bond type and properties?</w:t>
+            </w:r>
+          </w:p>
+          <w:p>
+            <w:pPr>
+              <w:spacing w:before="20" w:after="20"/>
+              <w:ind w:left="240"/>
+              <w:jc w:val="left"/>
+            </w:pPr>
+            <w:r>
+              <w:rPr>
+                <w:rFonts w:ascii="Arial" w:hAnsi="Arial"/>
+                <w:b w:val="0"/>
+                <w:i w:val="0"/>
+                <w:color w:val="000000"/>
+                <w:sz w:val="18"/>
+              </w:rPr>
+              <w:t>• Why do these patterns exist?</w:t>
+            </w:r>
+          </w:p>
+          <w:p>
+            <w:pPr>
+              <w:spacing w:before="20" w:after="20"/>
+              <w:jc w:val="left"/>
+            </w:pPr>
+            <w:r>
+              <w:rPr>
+                <w:rFonts w:ascii="Arial" w:hAnsi="Arial"/>
+                <w:b/>
+                <w:i w:val="0"/>
+                <w:color w:val="000000"/>
+                <w:sz w:val="18"/>
+              </w:rPr>
+              <w:t>What to Include:</w:t>
+            </w:r>
+          </w:p>
+          <w:p>
+            <w:pPr>
+              <w:spacing w:before="20" w:after="20"/>
+              <w:jc w:val="left"/>
+            </w:pPr>
+            <w:r>
+              <w:rPr>
+                <w:rFonts w:ascii="Arial" w:hAnsi="Arial"/>
+                <w:b/>
+                <w:i w:val="0"/>
+                <w:color w:val="000000"/>
+                <w:sz w:val="18"/>
+              </w:rPr>
+              <w:t>Create and explain a comparison table covering:</w:t>
+            </w:r>
+          </w:p>
+          <w:p>
+            <w:pPr>
+              <w:spacing w:before="20" w:after="20"/>
+              <w:ind w:left="240"/>
+              <w:jc w:val="left"/>
+            </w:pPr>
+            <w:r>
+              <w:rPr>
+                <w:rFonts w:ascii="Arial" w:hAnsi="Arial"/>
+                <w:b w:val="0"/>
+                <w:i w:val="0"/>
+                <w:color w:val="000000"/>
+                <w:sz w:val="18"/>
+              </w:rPr>
+              <w:t>• Property  |  Ionic Compounds</w:t>
+            </w:r>
+          </w:p>
+          <w:p>
+            <w:pPr>
+              <w:spacing w:before="20" w:after="20"/>
+              <w:ind w:left="240"/>
+              <w:jc w:val="left"/>
+            </w:pPr>
+            <w:r>
+              <w:rPr>
+                <w:rFonts w:ascii="Arial" w:hAnsi="Arial"/>
+                <w:b w:val="0"/>
+                <w:i w:val="0"/>
+                <w:color w:val="000000"/>
+                <w:sz w:val="18"/>
+              </w:rPr>
+              <w:t>• Examples  |  NaCl, MgO, CaCO₃</w:t>
+            </w:r>
+          </w:p>
+          <w:p>
+            <w:pPr>
+              <w:spacing w:before="20" w:after="20"/>
+              <w:ind w:left="240"/>
+              <w:jc w:val="left"/>
+            </w:pPr>
+            <w:r>
+              <w:rPr>
+                <w:rFonts w:ascii="Arial" w:hAnsi="Arial"/>
+                <w:b w:val="0"/>
+                <w:i w:val="0"/>
+                <w:color w:val="000000"/>
+                <w:sz w:val="18"/>
+              </w:rPr>
+              <w:t>• Bonding within structure  |  Electrostatic attraction between ions</w:t>
+            </w:r>
+          </w:p>
+          <w:p>
+            <w:pPr>
+              <w:spacing w:before="20" w:after="20"/>
+              <w:ind w:left="240"/>
+              <w:jc w:val="left"/>
+            </w:pPr>
+            <w:r>
+              <w:rPr>
+                <w:rFonts w:ascii="Arial" w:hAnsi="Arial"/>
+                <w:b w:val="0"/>
+                <w:i w:val="0"/>
+                <w:color w:val="000000"/>
+                <w:sz w:val="18"/>
+              </w:rPr>
+              <w:t>• Forces between particles  |  Strong ionic bonds</w:t>
+            </w:r>
+          </w:p>
+          <w:p>
+            <w:pPr>
+              <w:spacing w:before="20" w:after="20"/>
+              <w:ind w:left="240"/>
+              <w:jc w:val="left"/>
+            </w:pPr>
+            <w:r>
+              <w:rPr>
+                <w:rFonts w:ascii="Arial" w:hAnsi="Arial"/>
+                <w:b w:val="0"/>
+                <w:i w:val="0"/>
+                <w:color w:val="000000"/>
+                <w:sz w:val="18"/>
+              </w:rPr>
+              <w:t>• Melting/Boiling Point  |  High</w:t>
+            </w:r>
+          </w:p>
+          <w:p>
+            <w:pPr>
+              <w:spacing w:before="20" w:after="20"/>
+              <w:ind w:left="240"/>
+              <w:jc w:val="left"/>
+            </w:pPr>
+            <w:r>
+              <w:rPr>
+                <w:rFonts w:ascii="Arial" w:hAnsi="Arial"/>
+                <w:b w:val="0"/>
+                <w:i w:val="0"/>
+                <w:color w:val="000000"/>
+                <w:sz w:val="18"/>
+              </w:rPr>
+              <w:t>• Electrical Conductivity (solid)  |  No</w:t>
+            </w:r>
+          </w:p>
+          <w:p>
+            <w:pPr>
+              <w:spacing w:before="20" w:after="20"/>
+              <w:ind w:left="240"/>
+              <w:jc w:val="left"/>
+            </w:pPr>
+            <w:r>
+              <w:rPr>
+                <w:rFonts w:ascii="Arial" w:hAnsi="Arial"/>
+                <w:b w:val="0"/>
+                <w:i w:val="0"/>
+                <w:color w:val="000000"/>
+                <w:sz w:val="18"/>
+              </w:rPr>
+              <w:t>• Electrical Conductivity (liquid/solution)  |  Yes</w:t>
+            </w:r>
+          </w:p>
+          <w:p>
+            <w:pPr>
+              <w:spacing w:before="20" w:after="20"/>
+              <w:ind w:left="240"/>
+              <w:jc w:val="left"/>
+            </w:pPr>
+            <w:r>
+              <w:rPr>
+                <w:rFonts w:ascii="Arial" w:hAnsi="Arial"/>
+                <w:b w:val="0"/>
+                <w:i w:val="0"/>
+                <w:color w:val="000000"/>
+                <w:sz w:val="18"/>
+              </w:rPr>
+              <w:t>• Hardness  |  Hard but brittle</w:t>
+            </w:r>
+          </w:p>
+          <w:p>
+            <w:pPr>
+              <w:spacing w:before="20" w:after="20"/>
+              <w:ind w:left="240"/>
+              <w:jc w:val="left"/>
+            </w:pPr>
+            <w:r>
+              <w:rPr>
+                <w:rFonts w:ascii="Arial" w:hAnsi="Arial"/>
+                <w:b w:val="0"/>
+                <w:i w:val="0"/>
+                <w:color w:val="000000"/>
+                <w:sz w:val="18"/>
+              </w:rPr>
+              <w:t>• Solubility in water  |  Often soluble</w:t>
+            </w:r>
+          </w:p>
+          <w:p>
+            <w:pPr>
+              <w:spacing w:before="20" w:after="20"/>
+              <w:jc w:val="left"/>
+            </w:pPr>
+            <w:r>
+              <w:rPr>
+                <w:rFonts w:ascii="Arial" w:hAnsi="Arial"/>
+                <w:b w:val="0"/>
+                <w:i w:val="0"/>
+                <w:color w:val="000000"/>
+                <w:sz w:val="18"/>
+              </w:rPr>
+              <w:t>Explain the reasons for each property pattern based on structure and bonding.</w:t>
             </w:r>
           </w:p>
         </w:tc>
@@ -2406,6 +3734,22 @@
           <w:p>
             <w:pPr>
               <w:spacing w:before="20" w:after="20"/>
+              <w:jc w:val="left"/>
+            </w:pPr>
+            <w:r>
+              <w:rPr>
+                <w:rFonts w:ascii="Arial" w:hAnsi="Arial"/>
+                <w:b/>
+                <w:i w:val="0"/>
+                <w:color w:val="000000"/>
+                <w:sz w:val="18"/>
+              </w:rPr>
+              <w:t>Guiding Questions:</w:t>
+            </w:r>
+          </w:p>
+          <w:p>
+            <w:pPr>
+              <w:spacing w:before="20" w:after="20"/>
               <w:ind w:left="240"/>
               <w:jc w:val="left"/>
             </w:pPr>
@@ -2417,7 +3761,263 @@
                 <w:color w:val="000000"/>
                 <w:sz w:val="18"/>
               </w:rPr>
-              <w:t>• How do the properties of substances determine their uses?</w:t>
+              <w:t>• How do the properties of substances determine their uses? - Can you explain specific real-world applications using bonding concepts?</w:t>
+            </w:r>
+          </w:p>
+          <w:p>
+            <w:pPr>
+              <w:spacing w:before="20" w:after="20"/>
+              <w:jc w:val="left"/>
+            </w:pPr>
+            <w:r>
+              <w:rPr>
+                <w:rFonts w:ascii="Arial" w:hAnsi="Arial"/>
+                <w:b/>
+                <w:i w:val="0"/>
+                <w:color w:val="000000"/>
+                <w:sz w:val="18"/>
+              </w:rPr>
+              <w:t>What to Include:</w:t>
+            </w:r>
+          </w:p>
+          <w:p>
+            <w:pPr>
+              <w:spacing w:before="20" w:after="20"/>
+              <w:jc w:val="left"/>
+            </w:pPr>
+            <w:r>
+              <w:rPr>
+                <w:rFonts w:ascii="Arial" w:hAnsi="Arial"/>
+                <w:b w:val="0"/>
+                <w:i w:val="0"/>
+                <w:color w:val="000000"/>
+                <w:sz w:val="18"/>
+              </w:rPr>
+              <w:t>Choose at least 4 substances and explain how their bonding and structure make them suitable for their uses:</w:t>
+            </w:r>
+          </w:p>
+          <w:p>
+            <w:pPr>
+              <w:spacing w:before="20" w:after="20"/>
+              <w:jc w:val="left"/>
+            </w:pPr>
+            <w:r>
+              <w:rPr>
+                <w:rFonts w:ascii="Arial" w:hAnsi="Arial"/>
+                <w:b/>
+                <w:i w:val="0"/>
+                <w:color w:val="000000"/>
+                <w:sz w:val="18"/>
+              </w:rPr>
+              <w:t>Example substances to discuss:</w:t>
+            </w:r>
+          </w:p>
+          <w:p>
+            <w:pPr>
+              <w:spacing w:before="20" w:after="20"/>
+              <w:jc w:val="left"/>
+            </w:pPr>
+            <w:r>
+              <w:rPr>
+                <w:rFonts w:ascii="Arial" w:hAnsi="Arial"/>
+                <w:b w:val="0"/>
+                <w:i w:val="0"/>
+                <w:color w:val="000000"/>
+                <w:sz w:val="18"/>
+              </w:rPr>
+              <w:t>Sodium chloride (NaCl) — Table salt and de-icing roads</w:t>
+            </w:r>
+          </w:p>
+          <w:p>
+            <w:pPr>
+              <w:spacing w:before="20" w:after="20"/>
+              <w:jc w:val="left"/>
+            </w:pPr>
+            <w:r>
+              <w:rPr>
+                <w:rFonts w:ascii="Arial" w:hAnsi="Arial"/>
+                <w:b w:val="0"/>
+                <w:i w:val="0"/>
+                <w:color w:val="000000"/>
+                <w:sz w:val="18"/>
+              </w:rPr>
+              <w:t>Ionic bonding → soluble in water, safe to consume, lowers freezing point of water</w:t>
+            </w:r>
+          </w:p>
+          <w:p>
+            <w:pPr>
+              <w:spacing w:before="20" w:after="20"/>
+              <w:jc w:val="left"/>
+            </w:pPr>
+            <w:r>
+              <w:rPr>
+                <w:rFonts w:ascii="Arial" w:hAnsi="Arial"/>
+                <w:b w:val="0"/>
+                <w:i w:val="0"/>
+                <w:color w:val="000000"/>
+                <w:sz w:val="18"/>
+              </w:rPr>
+              <w:t>Diamond — Cutting tools, drill bits, jewelry</w:t>
+            </w:r>
+          </w:p>
+          <w:p>
+            <w:pPr>
+              <w:spacing w:before="20" w:after="20"/>
+              <w:jc w:val="left"/>
+            </w:pPr>
+            <w:r>
+              <w:rPr>
+                <w:rFonts w:ascii="Arial" w:hAnsi="Arial"/>
+                <w:b w:val="0"/>
+                <w:i w:val="0"/>
+                <w:color w:val="000000"/>
+                <w:sz w:val="18"/>
+              </w:rPr>
+              <w:t>Giant covalent structure → extremely hard, does not scratch easily, brilliant when cut</w:t>
+            </w:r>
+          </w:p>
+          <w:p>
+            <w:pPr>
+              <w:spacing w:before="20" w:after="20"/>
+              <w:jc w:val="left"/>
+            </w:pPr>
+            <w:r>
+              <w:rPr>
+                <w:rFonts w:ascii="Arial" w:hAnsi="Arial"/>
+                <w:b w:val="0"/>
+                <w:i w:val="0"/>
+                <w:color w:val="000000"/>
+                <w:sz w:val="18"/>
+              </w:rPr>
+              <w:t>Graphite — Pencil leads, lubricants, electrodes</w:t>
+            </w:r>
+          </w:p>
+          <w:p>
+            <w:pPr>
+              <w:spacing w:before="20" w:after="20"/>
+              <w:jc w:val="left"/>
+            </w:pPr>
+            <w:r>
+              <w:rPr>
+                <w:rFonts w:ascii="Arial" w:hAnsi="Arial"/>
+                <w:b w:val="0"/>
+                <w:i w:val="0"/>
+                <w:color w:val="000000"/>
+                <w:sz w:val="18"/>
+              </w:rPr>
+              <w:t>Layered giant covalent structure → layers slide easily (soft, lubricating), conducts electricity</w:t>
+            </w:r>
+          </w:p>
+          <w:p>
+            <w:pPr>
+              <w:spacing w:before="20" w:after="20"/>
+              <w:jc w:val="left"/>
+            </w:pPr>
+            <w:r>
+              <w:rPr>
+                <w:rFonts w:ascii="Arial" w:hAnsi="Arial"/>
+                <w:b w:val="0"/>
+                <w:i w:val="0"/>
+                <w:color w:val="000000"/>
+                <w:sz w:val="18"/>
+              </w:rPr>
+              <w:t>Metals (copper, aluminum, iron) — Electrical wiring, construction, cookware</w:t>
+            </w:r>
+          </w:p>
+          <w:p>
+            <w:pPr>
+              <w:spacing w:before="20" w:after="20"/>
+              <w:jc w:val="left"/>
+            </w:pPr>
+            <w:r>
+              <w:rPr>
+                <w:rFonts w:ascii="Arial" w:hAnsi="Arial"/>
+                <w:b w:val="0"/>
+                <w:i w:val="0"/>
+                <w:color w:val="000000"/>
+                <w:sz w:val="18"/>
+              </w:rPr>
+              <w:t>Metallic bonding → conducts electricity and heat, malleable, ductile, strong</w:t>
+            </w:r>
+          </w:p>
+          <w:p>
+            <w:pPr>
+              <w:spacing w:before="20" w:after="20"/>
+              <w:jc w:val="left"/>
+            </w:pPr>
+            <w:r>
+              <w:rPr>
+                <w:rFonts w:ascii="Arial" w:hAnsi="Arial"/>
+                <w:b w:val="0"/>
+                <w:i w:val="0"/>
+                <w:color w:val="000000"/>
+                <w:sz w:val="18"/>
+              </w:rPr>
+              <w:t>Water (H₂O) — Universal solvent, biological processes</w:t>
+            </w:r>
+          </w:p>
+          <w:p>
+            <w:pPr>
+              <w:spacing w:before="20" w:after="20"/>
+              <w:jc w:val="left"/>
+            </w:pPr>
+            <w:r>
+              <w:rPr>
+                <w:rFonts w:ascii="Arial" w:hAnsi="Arial"/>
+                <w:b w:val="0"/>
+                <w:i w:val="0"/>
+                <w:color w:val="000000"/>
+                <w:sz w:val="18"/>
+              </w:rPr>
+              <w:t>Hydrogen bonding → high boiling point (liquid at room temperature), excellent solvent for ionic and polar substances</w:t>
+            </w:r>
+          </w:p>
+          <w:p>
+            <w:pPr>
+              <w:spacing w:before="20" w:after="20"/>
+              <w:jc w:val="left"/>
+            </w:pPr>
+            <w:r>
+              <w:rPr>
+                <w:rFonts w:ascii="Arial" w:hAnsi="Arial"/>
+                <w:b w:val="0"/>
+                <w:i w:val="0"/>
+                <w:color w:val="000000"/>
+                <w:sz w:val="18"/>
+              </w:rPr>
+              <w:t>Silicon dioxide (SiO₂) — Glass, electronics, construction</w:t>
+            </w:r>
+          </w:p>
+          <w:p>
+            <w:pPr>
+              <w:spacing w:before="20" w:after="20"/>
+              <w:jc w:val="left"/>
+            </w:pPr>
+            <w:r>
+              <w:rPr>
+                <w:rFonts w:ascii="Arial" w:hAnsi="Arial"/>
+                <w:b w:val="0"/>
+                <w:i w:val="0"/>
+                <w:color w:val="000000"/>
+                <w:sz w:val="18"/>
+              </w:rPr>
+              <w:t>Giant covalent structure → very hard, high melting point, transparent when pure</w:t>
+            </w:r>
+          </w:p>
+          <w:p>
+            <w:pPr>
+              <w:spacing w:before="20" w:after="20"/>
+              <w:jc w:val="left"/>
+            </w:pPr>
+            <w:r>
+              <w:rPr>
+                <w:rFonts w:ascii="Arial" w:hAnsi="Arial"/>
+                <w:b/>
+                <w:i w:val="0"/>
+                <w:color w:val="000000"/>
+                <w:sz w:val="18"/>
+              </w:rPr>
+              <w:t>For each substance, explain:</w:t>
             </w:r>
           </w:p>
           <w:p>
@@ -2434,55 +4034,58 @@
                 <w:color w:val="000000"/>
                 <w:sz w:val="18"/>
               </w:rPr>
-              <w:t>• Can you explain specific real-world applications using bonding concepts?</w:t>
-            </w:r>
-          </w:p>
-          <w:p>
-            <w:pPr>
-              <w:spacing w:before="20" w:after="20"/>
-              <w:jc w:val="left"/>
-            </w:pPr>
-            <w:r>
-              <w:rPr>
-                <w:rFonts w:ascii="Arial" w:hAnsi="Arial"/>
-                <w:b w:val="0"/>
-                <w:i w:val="0"/>
-                <w:color w:val="000000"/>
-                <w:sz w:val="18"/>
-              </w:rPr>
-              <w:t>Choose at least 4 substances and explain how their bonding and structure make them suitable for their uses.</w:t>
-            </w:r>
-          </w:p>
-          <w:p>
-            <w:pPr>
-              <w:spacing w:before="20" w:after="20"/>
-              <w:jc w:val="left"/>
-            </w:pPr>
-            <w:r>
-              <w:rPr>
-                <w:rFonts w:ascii="Arial" w:hAnsi="Arial"/>
-                <w:b/>
-                <w:i w:val="0"/>
-                <w:color w:val="000000"/>
-                <w:sz w:val="18"/>
-              </w:rPr>
-              <w:t>For each substance explain:</w:t>
-            </w:r>
-          </w:p>
-          <w:p>
-            <w:pPr>
-              <w:spacing w:before="20" w:after="20"/>
-              <w:jc w:val="left"/>
-            </w:pPr>
-            <w:r>
-              <w:rPr>
-                <w:rFonts w:ascii="Arial" w:hAnsi="Arial"/>
-                <w:b w:val="0"/>
-                <w:i w:val="0"/>
-                <w:color w:val="000000"/>
-                <w:sz w:val="18"/>
-              </w:rPr>
-              <w:t>what type of bonding it has; what structure this creates; what properties result; how these properties make it useful.</w:t>
+              <w:t>• What type of bonding it has</w:t>
+            </w:r>
+          </w:p>
+          <w:p>
+            <w:pPr>
+              <w:spacing w:before="20" w:after="20"/>
+              <w:ind w:left="240"/>
+              <w:jc w:val="left"/>
+            </w:pPr>
+            <w:r>
+              <w:rPr>
+                <w:rFonts w:ascii="Arial" w:hAnsi="Arial"/>
+                <w:b w:val="0"/>
+                <w:i w:val="0"/>
+                <w:color w:val="000000"/>
+                <w:sz w:val="18"/>
+              </w:rPr>
+              <w:t>• What structure this creates</w:t>
+            </w:r>
+          </w:p>
+          <w:p>
+            <w:pPr>
+              <w:spacing w:before="20" w:after="20"/>
+              <w:ind w:left="240"/>
+              <w:jc w:val="left"/>
+            </w:pPr>
+            <w:r>
+              <w:rPr>
+                <w:rFonts w:ascii="Arial" w:hAnsi="Arial"/>
+                <w:b w:val="0"/>
+                <w:i w:val="0"/>
+                <w:color w:val="000000"/>
+                <w:sz w:val="18"/>
+              </w:rPr>
+              <w:t>• What properties result from this structure</w:t>
+            </w:r>
+          </w:p>
+          <w:p>
+            <w:pPr>
+              <w:spacing w:before="20" w:after="20"/>
+              <w:ind w:left="240"/>
+              <w:jc w:val="left"/>
+            </w:pPr>
+            <w:r>
+              <w:rPr>
+                <w:rFonts w:ascii="Arial" w:hAnsi="Arial"/>
+                <w:b w:val="0"/>
+                <w:i w:val="0"/>
+                <w:color w:val="000000"/>
+                <w:sz w:val="18"/>
+              </w:rPr>
+              <w:t>• How these properties make it useful for specific applications</w:t>
             </w:r>
           </w:p>
         </w:tc>
@@ -3765,6 +5368,12 @@
         </w:tc>
       </w:tr>
     </w:tbl>
+    <w:p>
+      <w:pPr>
+        <w:spacing w:before="0" w:after="0"/>
+        <w:spacing w:before="0" w:after="0" w:line="240" w:lineRule="auto"/>
+      </w:pPr>
+    </w:p>
     <w:tbl>
       <w:tblPr>
         <w:tblW w:type="auto" w:w="0"/>

</xml_diff>